<commit_message>
docs: expand SalesPulse admin guide with full env vars reference and all admin URLs
All environment variables documented with purpose, format, example, and exact
source (SF Setup URLs, Anthropic Console, OpenAI, Google AI Studio, etc.).
Every operational step has an exact Azure Portal deep-link URL. Shared DB
coordination warnings added throughout.

Co-Authored-By: Claude Sonnet 4.6 <noreply@anthropic.com>
</commit_message>
<xml_diff>
--- a/docs/dr/SalesPulse_Admin_Guide.docx
+++ b/docs/dr/SalesPulse_Admin_Guide.docx
@@ -20,7 +20,7 @@
           <w:color w:val="444444"/>
           <w:sz w:val="22"/>
         </w:rPr>
-        <w:t>Day-to-day operations · Configuration · Monitoring · Access management</w:t>
+        <w:t>Day-to-day operations · Configuration · Monitoring · Access management · Environment Variables</w:t>
       </w:r>
     </w:p>
     <w:p>
@@ -47,14 +47,6 @@
         <w:t>1. Quick Reference — All Admin URLs</w:t>
       </w:r>
     </w:p>
-    <w:p>
-      <w:r>
-        <w:rPr>
-          <w:sz w:val="22"/>
-        </w:rPr>
-        <w:t>Bookmark these links. Every step in this guide references one of them directly.</w:t>
-      </w:r>
-    </w:p>
     <w:tbl>
       <w:tblPr>
         <w:tblStyle w:val="LightShading-Accent1"/>
@@ -62,13 +54,13 @@
         <w:tblLook w:firstColumn="1" w:firstRow="1" w:lastColumn="0" w:lastRow="0" w:noHBand="0" w:noVBand="1" w:val="04A0"/>
       </w:tblPr>
       <w:tblGrid>
-        <w:gridCol w:w="4703"/>
-        <w:gridCol w:w="4703"/>
+        <w:gridCol w:w="4986"/>
+        <w:gridCol w:w="4986"/>
       </w:tblGrid>
       <w:tr>
         <w:tc>
           <w:tcPr>
-            <w:tcW w:type="dxa" w:w="4703"/>
+            <w:tcW w:type="dxa" w:w="4986"/>
           </w:tcPr>
           <w:p>
             <w:r>
@@ -82,7 +74,7 @@
         </w:tc>
         <w:tc>
           <w:tcPr>
-            <w:tcW w:type="dxa" w:w="4703"/>
+            <w:tcW w:type="dxa" w:w="4986"/>
           </w:tcPr>
           <w:p>
             <w:r>
@@ -90,7 +82,7 @@
                 <w:b/>
                 <w:sz w:val="20"/>
               </w:rPr>
-              <w:t>Exact Azure Portal URL</w:t>
+              <w:t>Exact URL</w:t>
             </w:r>
           </w:p>
         </w:tc>
@@ -98,20 +90,20 @@
       <w:tr>
         <w:tc>
           <w:tcPr>
-            <w:tcW w:type="dxa" w:w="4703"/>
+            <w:tcW w:type="dxa" w:w="4986"/>
           </w:tcPr>
           <w:p>
             <w:r>
               <w:rPr>
                 <w:sz w:val="18"/>
               </w:rPr>
-              <w:t>SalesPulse — Live App</w:t>
+              <w:t>SalesPulse — Live Application</w:t>
             </w:r>
           </w:p>
         </w:tc>
         <w:tc>
           <w:tcPr>
-            <w:tcW w:type="dxa" w:w="4703"/>
+            <w:tcW w:type="dxa" w:w="4986"/>
           </w:tcPr>
           <w:p>
             <w:r>
@@ -126,20 +118,20 @@
       <w:tr>
         <w:tc>
           <w:tcPr>
-            <w:tcW w:type="dxa" w:w="4703"/>
+            <w:tcW w:type="dxa" w:w="4986"/>
           </w:tcPr>
           <w:p>
             <w:r>
               <w:rPr>
                 <w:sz w:val="18"/>
               </w:rPr>
-              <w:t>SalesPulse — Admin Health Panel</w:t>
+              <w:t>SalesPulse — Admin Panel</w:t>
             </w:r>
           </w:p>
         </w:tc>
         <w:tc>
           <w:tcPr>
-            <w:tcW w:type="dxa" w:w="4703"/>
+            <w:tcW w:type="dxa" w:w="4986"/>
           </w:tcPr>
           <w:p>
             <w:r>
@@ -154,7 +146,7 @@
       <w:tr>
         <w:tc>
           <w:tcPr>
-            <w:tcW w:type="dxa" w:w="4703"/>
+            <w:tcW w:type="dxa" w:w="4986"/>
           </w:tcPr>
           <w:p>
             <w:r>
@@ -167,7 +159,7 @@
         </w:tc>
         <w:tc>
           <w:tcPr>
-            <w:tcW w:type="dxa" w:w="4703"/>
+            <w:tcW w:type="dxa" w:w="4986"/>
           </w:tcPr>
           <w:p>
             <w:r>
@@ -182,7 +174,7 @@
       <w:tr>
         <w:tc>
           <w:tcPr>
-            <w:tcW w:type="dxa" w:w="4703"/>
+            <w:tcW w:type="dxa" w:w="4986"/>
           </w:tcPr>
           <w:p>
             <w:r>
@@ -195,7 +187,7 @@
         </w:tc>
         <w:tc>
           <w:tcPr>
-            <w:tcW w:type="dxa" w:w="4703"/>
+            <w:tcW w:type="dxa" w:w="4986"/>
           </w:tcPr>
           <w:p>
             <w:r>
@@ -210,7 +202,7 @@
       <w:tr>
         <w:tc>
           <w:tcPr>
-            <w:tcW w:type="dxa" w:w="4703"/>
+            <w:tcW w:type="dxa" w:w="4986"/>
           </w:tcPr>
           <w:p>
             <w:r>
@@ -223,7 +215,7 @@
         </w:tc>
         <w:tc>
           <w:tcPr>
-            <w:tcW w:type="dxa" w:w="4703"/>
+            <w:tcW w:type="dxa" w:w="4986"/>
           </w:tcPr>
           <w:p>
             <w:r>
@@ -238,7 +230,7 @@
       <w:tr>
         <w:tc>
           <w:tcPr>
-            <w:tcW w:type="dxa" w:w="4703"/>
+            <w:tcW w:type="dxa" w:w="4986"/>
           </w:tcPr>
           <w:p>
             <w:r>
@@ -251,7 +243,7 @@
         </w:tc>
         <w:tc>
           <w:tcPr>
-            <w:tcW w:type="dxa" w:w="4703"/>
+            <w:tcW w:type="dxa" w:w="4986"/>
           </w:tcPr>
           <w:p>
             <w:r>
@@ -266,7 +258,7 @@
       <w:tr>
         <w:tc>
           <w:tcPr>
-            <w:tcW w:type="dxa" w:w="4703"/>
+            <w:tcW w:type="dxa" w:w="4986"/>
           </w:tcPr>
           <w:p>
             <w:r>
@@ -279,7 +271,7 @@
         </w:tc>
         <w:tc>
           <w:tcPr>
-            <w:tcW w:type="dxa" w:w="4703"/>
+            <w:tcW w:type="dxa" w:w="4986"/>
           </w:tcPr>
           <w:p>
             <w:r>
@@ -294,7 +286,7 @@
       <w:tr>
         <w:tc>
           <w:tcPr>
-            <w:tcW w:type="dxa" w:w="4703"/>
+            <w:tcW w:type="dxa" w:w="4986"/>
           </w:tcPr>
           <w:p>
             <w:r>
@@ -307,7 +299,7 @@
         </w:tc>
         <w:tc>
           <w:tcPr>
-            <w:tcW w:type="dxa" w:w="4703"/>
+            <w:tcW w:type="dxa" w:w="4986"/>
           </w:tcPr>
           <w:p>
             <w:r>
@@ -322,20 +314,20 @@
       <w:tr>
         <w:tc>
           <w:tcPr>
-            <w:tcW w:type="dxa" w:w="4703"/>
+            <w:tcW w:type="dxa" w:w="4986"/>
           </w:tcPr>
           <w:p>
             <w:r>
               <w:rPr>
                 <w:sz w:val="18"/>
               </w:rPr>
-              <w:t>SalesPulse — Access Control (IAM)</w:t>
+              <w:t>SalesPulse — Access Control / IAM</w:t>
             </w:r>
           </w:p>
         </w:tc>
         <w:tc>
           <w:tcPr>
-            <w:tcW w:type="dxa" w:w="4703"/>
+            <w:tcW w:type="dxa" w:w="4986"/>
           </w:tcPr>
           <w:p>
             <w:r>
@@ -350,20 +342,20 @@
       <w:tr>
         <w:tc>
           <w:tcPr>
-            <w:tcW w:type="dxa" w:w="4703"/>
+            <w:tcW w:type="dxa" w:w="4986"/>
           </w:tcPr>
           <w:p>
             <w:r>
               <w:rPr>
                 <w:sz w:val="18"/>
               </w:rPr>
-              <w:t>SalesPulse DR — App Service</w:t>
+              <w:t>SalesPulse DR — App Service Overview</w:t>
             </w:r>
           </w:p>
         </w:tc>
         <w:tc>
           <w:tcPr>
-            <w:tcW w:type="dxa" w:w="4703"/>
+            <w:tcW w:type="dxa" w:w="4986"/>
           </w:tcPr>
           <w:p>
             <w:r>
@@ -378,20 +370,20 @@
       <w:tr>
         <w:tc>
           <w:tcPr>
-            <w:tcW w:type="dxa" w:w="4703"/>
+            <w:tcW w:type="dxa" w:w="4986"/>
           </w:tcPr>
           <w:p>
             <w:r>
               <w:rPr>
                 <w:sz w:val="18"/>
               </w:rPr>
-              <w:t>SalesPulse DR — Environment Vars</w:t>
+              <w:t>SalesPulse DR — Environment Variables</w:t>
             </w:r>
           </w:p>
         </w:tc>
         <w:tc>
           <w:tcPr>
-            <w:tcW w:type="dxa" w:w="4703"/>
+            <w:tcW w:type="dxa" w:w="4986"/>
           </w:tcPr>
           <w:p>
             <w:r>
@@ -406,20 +398,20 @@
       <w:tr>
         <w:tc>
           <w:tcPr>
-            <w:tcW w:type="dxa" w:w="4703"/>
+            <w:tcW w:type="dxa" w:w="4986"/>
           </w:tcPr>
           <w:p>
             <w:r>
               <w:rPr>
                 <w:sz w:val="18"/>
               </w:rPr>
-              <w:t>SalesPulse DR — Live App</w:t>
+              <w:t>SalesPulse DR — Live Application</w:t>
             </w:r>
           </w:p>
         </w:tc>
         <w:tc>
           <w:tcPr>
-            <w:tcW w:type="dxa" w:w="4703"/>
+            <w:tcW w:type="dxa" w:w="4986"/>
           </w:tcPr>
           <w:p>
             <w:r>
@@ -434,20 +426,20 @@
       <w:tr>
         <w:tc>
           <w:tcPr>
-            <w:tcW w:type="dxa" w:w="4703"/>
+            <w:tcW w:type="dxa" w:w="4986"/>
           </w:tcPr>
           <w:p>
             <w:r>
               <w:rPr>
                 <w:sz w:val="18"/>
               </w:rPr>
-              <w:t>PostgreSQL Primary — Overview</w:t>
+              <w:t>PostgreSQL (Shared) Primary — Overview</w:t>
             </w:r>
           </w:p>
         </w:tc>
         <w:tc>
           <w:tcPr>
-            <w:tcW w:type="dxa" w:w="4703"/>
+            <w:tcW w:type="dxa" w:w="4986"/>
           </w:tcPr>
           <w:p>
             <w:r>
@@ -462,20 +454,20 @@
       <w:tr>
         <w:tc>
           <w:tcPr>
-            <w:tcW w:type="dxa" w:w="4703"/>
+            <w:tcW w:type="dxa" w:w="4986"/>
           </w:tcPr>
           <w:p>
             <w:r>
               <w:rPr>
                 <w:sz w:val="18"/>
               </w:rPr>
-              <w:t>PostgreSQL Primary — Networking</w:t>
+              <w:t>PostgreSQL (Shared) Primary — Networking</w:t>
             </w:r>
           </w:p>
         </w:tc>
         <w:tc>
           <w:tcPr>
-            <w:tcW w:type="dxa" w:w="4703"/>
+            <w:tcW w:type="dxa" w:w="4986"/>
           </w:tcPr>
           <w:p>
             <w:r>
@@ -490,20 +482,20 @@
       <w:tr>
         <w:tc>
           <w:tcPr>
-            <w:tcW w:type="dxa" w:w="4703"/>
+            <w:tcW w:type="dxa" w:w="4986"/>
           </w:tcPr>
           <w:p>
             <w:r>
               <w:rPr>
                 <w:sz w:val="18"/>
               </w:rPr>
-              <w:t>PostgreSQL DR — Overview</w:t>
+              <w:t>PostgreSQL (Shared) DR — Overview</w:t>
             </w:r>
           </w:p>
         </w:tc>
         <w:tc>
           <w:tcPr>
-            <w:tcW w:type="dxa" w:w="4703"/>
+            <w:tcW w:type="dxa" w:w="4986"/>
           </w:tcPr>
           <w:p>
             <w:r>
@@ -518,27 +510,167 @@
       <w:tr>
         <w:tc>
           <w:tcPr>
-            <w:tcW w:type="dxa" w:w="4703"/>
+            <w:tcW w:type="dxa" w:w="4986"/>
           </w:tcPr>
           <w:p>
             <w:r>
               <w:rPr>
                 <w:sz w:val="18"/>
               </w:rPr>
-              <w:t>PostgreSQL DR — Networking</w:t>
+              <w:t>Salesforce — Connected Apps Setup</w:t>
             </w:r>
           </w:p>
         </w:tc>
         <w:tc>
           <w:tcPr>
-            <w:tcW w:type="dxa" w:w="4703"/>
+            <w:tcW w:type="dxa" w:w="4986"/>
           </w:tcPr>
           <w:p>
             <w:r>
               <w:rPr>
                 <w:sz w:val="18"/>
               </w:rPr>
-              <w:t>https://portal.azure.com/#@nyaaa.com/resource/subscriptions/e287db16-b6ae-415e-bd52-41c8ec5a8f08/resourceGroups/rg-nlaaroubi-sbx-eus2-001/providers/Microsoft.DBforPostgreSQL/flexibleServers/fslapp-pg-dr/networking</w:t>
+              <w:t>https://aaawcny.lightning.force.com/lightning/setup/ConnectedApplication/home</w:t>
+            </w:r>
+          </w:p>
+        </w:tc>
+      </w:tr>
+      <w:tr>
+        <w:tc>
+          <w:tcPr>
+            <w:tcW w:type="dxa" w:w="4986"/>
+          </w:tcPr>
+          <w:p>
+            <w:r>
+              <w:rPr>
+                <w:sz w:val="18"/>
+              </w:rPr>
+              <w:t>Anthropic Console — API Keys</w:t>
+            </w:r>
+          </w:p>
+        </w:tc>
+        <w:tc>
+          <w:tcPr>
+            <w:tcW w:type="dxa" w:w="4986"/>
+          </w:tcPr>
+          <w:p>
+            <w:r>
+              <w:rPr>
+                <w:sz w:val="18"/>
+              </w:rPr>
+              <w:t>https://console.anthropic.com/settings/keys</w:t>
+            </w:r>
+          </w:p>
+        </w:tc>
+      </w:tr>
+      <w:tr>
+        <w:tc>
+          <w:tcPr>
+            <w:tcW w:type="dxa" w:w="4986"/>
+          </w:tcPr>
+          <w:p>
+            <w:r>
+              <w:rPr>
+                <w:sz w:val="18"/>
+              </w:rPr>
+              <w:t>OpenAI Platform — API Keys</w:t>
+            </w:r>
+          </w:p>
+        </w:tc>
+        <w:tc>
+          <w:tcPr>
+            <w:tcW w:type="dxa" w:w="4986"/>
+          </w:tcPr>
+          <w:p>
+            <w:r>
+              <w:rPr>
+                <w:sz w:val="18"/>
+              </w:rPr>
+              <w:t>https://platform.openai.com/api-keys</w:t>
+            </w:r>
+          </w:p>
+        </w:tc>
+      </w:tr>
+      <w:tr>
+        <w:tc>
+          <w:tcPr>
+            <w:tcW w:type="dxa" w:w="4986"/>
+          </w:tcPr>
+          <w:p>
+            <w:r>
+              <w:rPr>
+                <w:sz w:val="18"/>
+              </w:rPr>
+              <w:t>Google AI Studio — API Keys</w:t>
+            </w:r>
+          </w:p>
+        </w:tc>
+        <w:tc>
+          <w:tcPr>
+            <w:tcW w:type="dxa" w:w="4986"/>
+          </w:tcPr>
+          <w:p>
+            <w:r>
+              <w:rPr>
+                <w:sz w:val="18"/>
+              </w:rPr>
+              <w:t>https://aistudio.google.com/app/apikey</w:t>
+            </w:r>
+          </w:p>
+        </w:tc>
+      </w:tr>
+      <w:tr>
+        <w:tc>
+          <w:tcPr>
+            <w:tcW w:type="dxa" w:w="4986"/>
+          </w:tcPr>
+          <w:p>
+            <w:r>
+              <w:rPr>
+                <w:sz w:val="18"/>
+              </w:rPr>
+              <w:t>Google Cloud Console — Maps API Keys</w:t>
+            </w:r>
+          </w:p>
+        </w:tc>
+        <w:tc>
+          <w:tcPr>
+            <w:tcW w:type="dxa" w:w="4986"/>
+          </w:tcPr>
+          <w:p>
+            <w:r>
+              <w:rPr>
+                <w:sz w:val="18"/>
+              </w:rPr>
+              <w:t>https://console.cloud.google.com/apis/credentials</w:t>
+            </w:r>
+          </w:p>
+        </w:tc>
+      </w:tr>
+      <w:tr>
+        <w:tc>
+          <w:tcPr>
+            <w:tcW w:type="dxa" w:w="4986"/>
+          </w:tcPr>
+          <w:p>
+            <w:r>
+              <w:rPr>
+                <w:sz w:val="18"/>
+              </w:rPr>
+              <w:t>GitHub — Personal Access Tokens</w:t>
+            </w:r>
+          </w:p>
+        </w:tc>
+        <w:tc>
+          <w:tcPr>
+            <w:tcW w:type="dxa" w:w="4986"/>
+          </w:tcPr>
+          <w:p>
+            <w:r>
+              <w:rPr>
+                <w:sz w:val="18"/>
+              </w:rPr>
+              <w:t>https://github.com/settings/tokens</w:t>
             </w:r>
           </w:p>
         </w:tc>
@@ -559,7 +691,7 @@
         <w:rPr>
           <w:sz w:val="22"/>
         </w:rPr>
-        <w:t>SalesPulse is a FastAPI/Python 3.12 analytics app on Azure App Service (West US 2, Basic B2). It shares the fslapp-pg PostgreSQL 16 database with FSLAPP — SalesPulse uses schema: sales. DR standby (salespulse-nyaaa-dr) is P1v3 Premium — one tier above primary for headroom.</w:t>
+        <w:t>SalesPulse is a FastAPI app on Azure App Service (West US 2, Basic B2). It uses the SAME shared PostgreSQL server as FSLAPP (fslapp-pg in East US 2) — schema: sales. DR is handled by salespulse-nyaaa-dr (West US 2, P1v3 — one tier above primary for headroom).</w:t>
       </w:r>
     </w:p>
     <w:p>
@@ -607,17 +739,17 @@
           <w:i/>
           <w:sz w:val="18"/>
         </w:rPr>
-        <w:t>Figure 1 — SalesPulse Azure DR Infrastructure</w:t>
+        <w:t>Figure 1 — SalesPulse Azure DR Infrastructure (shares fslapp-pg database with FSLAPP)</w:t>
       </w:r>
     </w:p>
     <w:p>
       <w:r>
         <w:rPr>
           <w:b/>
-          <w:color w:val="FF8C00"/>
+          <w:color w:val="CC0000"/>
           <w:sz w:val="20"/>
         </w:rPr>
-        <w:t>⚠  Shared DB: fslapp-pg is used by both SalesPulse (schema: sales) AND FSLAPP (core/optimizer). ANY database failover must coordinate BOTH apps simultaneously.</w:t>
+        <w:t>🔴  SHARED DATABASE: fslapp-pg and fslapp-pg-dr are shared with FSLAPP. Any DB-level change (firewall, server restart, failover) affects BOTH apps. Always coordinate with the FSLAPP team before touching the database.</w:t>
       </w:r>
     </w:p>
     <w:p>
@@ -636,15 +768,15 @@
         <w:tblLook w:firstColumn="1" w:firstRow="1" w:lastColumn="0" w:lastRow="0" w:noHBand="0" w:noVBand="1" w:val="04A0"/>
       </w:tblPr>
       <w:tblGrid>
-        <w:gridCol w:w="2351"/>
-        <w:gridCol w:w="2351"/>
-        <w:gridCol w:w="2351"/>
-        <w:gridCol w:w="2351"/>
+        <w:gridCol w:w="2493"/>
+        <w:gridCol w:w="2493"/>
+        <w:gridCol w:w="2493"/>
+        <w:gridCol w:w="2493"/>
       </w:tblGrid>
       <w:tr>
         <w:tc>
           <w:tcPr>
-            <w:tcW w:type="dxa" w:w="2351"/>
+            <w:tcW w:type="dxa" w:w="2493"/>
           </w:tcPr>
           <w:p>
             <w:r>
@@ -658,7 +790,7 @@
         </w:tc>
         <w:tc>
           <w:tcPr>
-            <w:tcW w:type="dxa" w:w="2351"/>
+            <w:tcW w:type="dxa" w:w="2493"/>
           </w:tcPr>
           <w:p>
             <w:r>
@@ -672,7 +804,7 @@
         </w:tc>
         <w:tc>
           <w:tcPr>
-            <w:tcW w:type="dxa" w:w="2351"/>
+            <w:tcW w:type="dxa" w:w="2493"/>
           </w:tcPr>
           <w:p>
             <w:r>
@@ -686,7 +818,7 @@
         </w:tc>
         <w:tc>
           <w:tcPr>
-            <w:tcW w:type="dxa" w:w="2351"/>
+            <w:tcW w:type="dxa" w:w="2493"/>
           </w:tcPr>
           <w:p>
             <w:r>
@@ -702,7 +834,7 @@
       <w:tr>
         <w:tc>
           <w:tcPr>
-            <w:tcW w:type="dxa" w:w="2351"/>
+            <w:tcW w:type="dxa" w:w="2493"/>
           </w:tcPr>
           <w:p>
             <w:r>
@@ -715,20 +847,20 @@
         </w:tc>
         <w:tc>
           <w:tcPr>
-            <w:tcW w:type="dxa" w:w="2351"/>
+            <w:tcW w:type="dxa" w:w="2493"/>
           </w:tcPr>
           <w:p>
             <w:r>
               <w:rPr>
                 <w:sz w:val="20"/>
               </w:rPr>
-              <w:t>App Service (primary)</w:t>
+              <w:t>App Service PRIMARY</w:t>
             </w:r>
           </w:p>
         </w:tc>
         <w:tc>
           <w:tcPr>
-            <w:tcW w:type="dxa" w:w="2351"/>
+            <w:tcW w:type="dxa" w:w="2493"/>
           </w:tcPr>
           <w:p>
             <w:r>
@@ -741,7 +873,7 @@
         </w:tc>
         <w:tc>
           <w:tcPr>
-            <w:tcW w:type="dxa" w:w="2351"/>
+            <w:tcW w:type="dxa" w:w="2493"/>
           </w:tcPr>
           <w:p>
             <w:r>
@@ -756,7 +888,7 @@
       <w:tr>
         <w:tc>
           <w:tcPr>
-            <w:tcW w:type="dxa" w:w="2351"/>
+            <w:tcW w:type="dxa" w:w="2493"/>
           </w:tcPr>
           <w:p>
             <w:r>
@@ -769,20 +901,20 @@
         </w:tc>
         <w:tc>
           <w:tcPr>
-            <w:tcW w:type="dxa" w:w="2351"/>
+            <w:tcW w:type="dxa" w:w="2493"/>
           </w:tcPr>
           <w:p>
             <w:r>
               <w:rPr>
                 <w:sz w:val="20"/>
               </w:rPr>
-              <w:t>App Service (DR)</w:t>
+              <w:t>App Service DR</w:t>
             </w:r>
           </w:p>
         </w:tc>
         <w:tc>
           <w:tcPr>
-            <w:tcW w:type="dxa" w:w="2351"/>
+            <w:tcW w:type="dxa" w:w="2493"/>
           </w:tcPr>
           <w:p>
             <w:r>
@@ -795,7 +927,7 @@
         </w:tc>
         <w:tc>
           <w:tcPr>
-            <w:tcW w:type="dxa" w:w="2351"/>
+            <w:tcW w:type="dxa" w:w="2493"/>
           </w:tcPr>
           <w:p>
             <w:r>
@@ -810,7 +942,7 @@
       <w:tr>
         <w:tc>
           <w:tcPr>
-            <w:tcW w:type="dxa" w:w="2351"/>
+            <w:tcW w:type="dxa" w:w="2493"/>
           </w:tcPr>
           <w:p>
             <w:r>
@@ -823,20 +955,20 @@
         </w:tc>
         <w:tc>
           <w:tcPr>
-            <w:tcW w:type="dxa" w:w="2351"/>
+            <w:tcW w:type="dxa" w:w="2493"/>
           </w:tcPr>
           <w:p>
             <w:r>
               <w:rPr>
                 <w:sz w:val="20"/>
               </w:rPr>
-              <w:t>PostgreSQL (shared primary)</w:t>
+              <w:t>PostgreSQL SHARED PRIMARY</w:t>
             </w:r>
           </w:p>
         </w:tc>
         <w:tc>
           <w:tcPr>
-            <w:tcW w:type="dxa" w:w="2351"/>
+            <w:tcW w:type="dxa" w:w="2493"/>
           </w:tcPr>
           <w:p>
             <w:r>
@@ -849,14 +981,14 @@
         </w:tc>
         <w:tc>
           <w:tcPr>
-            <w:tcW w:type="dxa" w:w="2351"/>
+            <w:tcW w:type="dxa" w:w="2493"/>
           </w:tcPr>
           <w:p>
             <w:r>
               <w:rPr>
                 <w:sz w:val="20"/>
               </w:rPr>
-              <w:t>fslapp-pg.postgres.database.azure.com</w:t>
+              <w:t>fslapp-pg.postgres.database.azure.com  (schema: sales)</w:t>
             </w:r>
           </w:p>
         </w:tc>
@@ -864,7 +996,7 @@
       <w:tr>
         <w:tc>
           <w:tcPr>
-            <w:tcW w:type="dxa" w:w="2351"/>
+            <w:tcW w:type="dxa" w:w="2493"/>
           </w:tcPr>
           <w:p>
             <w:r>
@@ -877,20 +1009,20 @@
         </w:tc>
         <w:tc>
           <w:tcPr>
-            <w:tcW w:type="dxa" w:w="2351"/>
+            <w:tcW w:type="dxa" w:w="2493"/>
           </w:tcPr>
           <w:p>
             <w:r>
               <w:rPr>
                 <w:sz w:val="20"/>
               </w:rPr>
-              <w:t>PostgreSQL (shared DR)</w:t>
+              <w:t>PostgreSQL SHARED DR</w:t>
             </w:r>
           </w:p>
         </w:tc>
         <w:tc>
           <w:tcPr>
-            <w:tcW w:type="dxa" w:w="2351"/>
+            <w:tcW w:type="dxa" w:w="2493"/>
           </w:tcPr>
           <w:p>
             <w:r>
@@ -903,7 +1035,7 @@
         </w:tc>
         <w:tc>
           <w:tcPr>
-            <w:tcW w:type="dxa" w:w="2351"/>
+            <w:tcW w:type="dxa" w:w="2493"/>
           </w:tcPr>
           <w:p>
             <w:r>
@@ -927,7 +1059,7 @@
         <w:jc w:val="left"/>
       </w:pPr>
       <w:r>
-        <w:t>3. App Service Admin</w:t>
+        <w:t>3. App Service — Day-to-Day Admin</w:t>
       </w:r>
     </w:p>
     <w:p>
@@ -966,7 +1098,7 @@
         <w:rPr>
           <w:sz w:val="22"/>
         </w:rPr>
-        <w:t>Status = Running (green dot). Click Start if stopped.</w:t>
+        <w:t>Status = Running (green). If Stopped → click Start.</w:t>
       </w:r>
     </w:p>
     <w:p>
@@ -977,64 +1109,7 @@
         <w:rPr>
           <w:sz w:val="22"/>
         </w:rPr>
-        <w:t xml:space="preserve">Browse to live app: </w:t>
-      </w:r>
-      <w:r>
-        <w:rPr>
-          <w:b/>
-          <w:color w:val="005ACC"/>
-          <w:sz w:val="20"/>
-        </w:rPr>
-        <w:t>https://salespulse-nyaaa.azurewebsites.net</w:t>
-      </w:r>
-    </w:p>
-    <w:p>
-      <w:r>
-        <w:drawing>
-          <wp:inline xmlns:a="http://schemas.openxmlformats.org/drawingml/2006/main" xmlns:pic="http://schemas.openxmlformats.org/drawingml/2006/picture">
-            <wp:extent cx="5943600" cy="2848637"/>
-            <wp:docPr id="2" name="Picture 2"/>
-            <wp:cNvGraphicFramePr>
-              <a:graphicFrameLocks noChangeAspect="1"/>
-            </wp:cNvGraphicFramePr>
-            <a:graphic>
-              <a:graphicData uri="http://schemas.openxmlformats.org/drawingml/2006/picture">
-                <pic:pic>
-                  <pic:nvPicPr>
-                    <pic:cNvPr id="0" name="01_appservice_overview.png"/>
-                    <pic:cNvPicPr/>
-                  </pic:nvPicPr>
-                  <pic:blipFill>
-                    <a:blip r:embed="rId10"/>
-                    <a:stretch>
-                      <a:fillRect/>
-                    </a:stretch>
-                  </pic:blipFill>
-                  <pic:spPr>
-                    <a:xfrm>
-                      <a:off x="0" y="0"/>
-                      <a:ext cx="5943600" cy="2848637"/>
-                    </a:xfrm>
-                    <a:prstGeom prst="rect"/>
-                  </pic:spPr>
-                </pic:pic>
-              </a:graphicData>
-            </a:graphic>
-          </wp:inline>
-        </w:drawing>
-      </w:r>
-    </w:p>
-    <w:p>
-      <w:pPr>
-        <w:jc w:val="center"/>
-      </w:pPr>
-      <w:r>
-        <w:rPr>
-          <w:i/>
-          <w:color w:val="555555"/>
-          <w:sz w:val="18"/>
-        </w:rPr>
-        <w:t>App Service Overview — same interface as shown. salespulse-nyaaa: Basic B2, West US 2, Python 3.12, Status: Running</w:t>
+        <w:t>Runtime status = Healthy confirms the Python process is responding.</w:t>
       </w:r>
     </w:p>
     <w:p>
@@ -1078,7 +1153,7 @@
         <w:rPr>
           <w:sz w:val="22"/>
         </w:rPr>
-        <w:t xml:space="preserve">  →  → click Restart in top toolbar → confirm</w:t>
+        <w:t xml:space="preserve">  →  → click Restart → confirm dialog</w:t>
       </w:r>
     </w:p>
     <w:p>
@@ -1136,7 +1211,7 @@
         <w:rPr>
           <w:sz w:val="22"/>
         </w:rPr>
-        <w:t>+ Add to create a new variable. Click variable name to edit. Trash icon to delete.</w:t>
+        <w:t>ADD: + Add → Name and Value → Apply</w:t>
       </w:r>
     </w:p>
     <w:p>
@@ -1147,17 +1222,7 @@
         <w:rPr>
           <w:sz w:val="22"/>
         </w:rPr>
-        <w:t>Click Apply at the bottom — app restarts automatically.</w:t>
-      </w:r>
-    </w:p>
-    <w:p>
-      <w:r>
-        <w:rPr>
-          <w:b/>
-          <w:color w:val="FF8C00"/>
-          <w:sz w:val="20"/>
-        </w:rPr>
-        <w:t>⚠  After changing PG_HOST or PG_DR_HOST, verify DB health:</w:t>
+        <w:t>EDIT: click variable name → change Value → Apply</w:t>
       </w:r>
     </w:p>
     <w:p>
@@ -1168,679 +1233,19 @@
         <w:rPr>
           <w:sz w:val="22"/>
         </w:rPr>
-        <w:t xml:space="preserve">Verify: </w:t>
-      </w:r>
-      <w:r>
-        <w:rPr>
-          <w:b/>
-          <w:color w:val="005ACC"/>
-          <w:sz w:val="20"/>
-        </w:rPr>
-        <w:t>https://salespulse-nyaaa.azurewebsites.net/admin</w:t>
-      </w:r>
-      <w:r>
-        <w:rPr>
-          <w:sz w:val="22"/>
-        </w:rPr>
-        <w:t xml:space="preserve">  →  → ADMIN_PIN → System Health → PostgreSQL = green</w:t>
+        <w:t>DELETE: trash icon → Apply</w:t>
       </w:r>
     </w:p>
     <w:p>
       <w:r>
-        <w:drawing>
-          <wp:inline xmlns:a="http://schemas.openxmlformats.org/drawingml/2006/main" xmlns:pic="http://schemas.openxmlformats.org/drawingml/2006/picture">
-            <wp:extent cx="5943600" cy="2848637"/>
-            <wp:docPr id="3" name="Picture 3"/>
-            <wp:cNvGraphicFramePr>
-              <a:graphicFrameLocks noChangeAspect="1"/>
-            </wp:cNvGraphicFramePr>
-            <a:graphic>
-              <a:graphicData uri="http://schemas.openxmlformats.org/drawingml/2006/picture">
-                <pic:pic>
-                  <pic:nvPicPr>
-                    <pic:cNvPr id="0" name="01_appservice_overview.png"/>
-                    <pic:cNvPicPr/>
-                  </pic:nvPicPr>
-                  <pic:blipFill>
-                    <a:blip r:embed="rId10"/>
-                    <a:stretch>
-                      <a:fillRect/>
-                    </a:stretch>
-                  </pic:blipFill>
-                  <pic:spPr>
-                    <a:xfrm>
-                      <a:off x="0" y="0"/>
-                      <a:ext cx="5943600" cy="2848637"/>
-                    </a:xfrm>
-                    <a:prstGeom prst="rect"/>
-                  </pic:spPr>
-                </pic:pic>
-              </a:graphicData>
-            </a:graphic>
-          </wp:inline>
-        </w:drawing>
+        <w:rPr>
+          <w:b/>
+          <w:color w:val="FF8C00"/>
+          <w:sz w:val="20"/>
+        </w:rPr>
+        <w:t>⚠  Every Apply triggers an automatic restart (~15s downtime).</w:t>
       </w:r>
     </w:p>
-    <w:p>
-      <w:pPr>
-        <w:jc w:val="center"/>
-      </w:pPr>
-      <w:r>
-        <w:rPr>
-          <w:i/>
-          <w:color w:val="555555"/>
-          <w:sz w:val="18"/>
-        </w:rPr>
-        <w:t>Environment Variables — App settings. Click any variable name to edit its value.</w:t>
-      </w:r>
-    </w:p>
-    <w:p>
-      <w:r>
-        <w:drawing>
-          <wp:inline xmlns:a="http://schemas.openxmlformats.org/drawingml/2006/main" xmlns:pic="http://schemas.openxmlformats.org/drawingml/2006/picture">
-            <wp:extent cx="5943600" cy="2848637"/>
-            <wp:docPr id="4" name="Picture 4"/>
-            <wp:cNvGraphicFramePr>
-              <a:graphicFrameLocks noChangeAspect="1"/>
-            </wp:cNvGraphicFramePr>
-            <a:graphic>
-              <a:graphicData uri="http://schemas.openxmlformats.org/drawingml/2006/picture">
-                <pic:pic>
-                  <pic:nvPicPr>
-                    <pic:cNvPr id="0" name="01_appservice_overview.png"/>
-                    <pic:cNvPicPr/>
-                  </pic:nvPicPr>
-                  <pic:blipFill>
-                    <a:blip r:embed="rId10"/>
-                    <a:stretch>
-                      <a:fillRect/>
-                    </a:stretch>
-                  </pic:blipFill>
-                  <pic:spPr>
-                    <a:xfrm>
-                      <a:off x="0" y="0"/>
-                      <a:ext cx="5943600" cy="2848637"/>
-                    </a:xfrm>
-                    <a:prstGeom prst="rect"/>
-                  </pic:spPr>
-                </pic:pic>
-              </a:graphicData>
-            </a:graphic>
-          </wp:inline>
-        </w:drawing>
-      </w:r>
-    </w:p>
-    <w:p>
-      <w:pPr>
-        <w:jc w:val="center"/>
-      </w:pPr>
-      <w:r>
-        <w:rPr>
-          <w:i/>
-          <w:color w:val="555555"/>
-          <w:sz w:val="18"/>
-        </w:rPr>
-        <w:t>PostgreSQL env vars: PG_HOST, PG_DATABASE, PG_USER — controls which DB the app connects to</w:t>
-      </w:r>
-    </w:p>
-    <w:p>
-      <w:pPr>
-        <w:pStyle w:val="Heading3"/>
-        <w:jc w:val="left"/>
-      </w:pPr>
-      <w:r>
-        <w:t>Key Environment Variables Reference</w:t>
-      </w:r>
-    </w:p>
-    <w:tbl>
-      <w:tblPr>
-        <w:tblStyle w:val="LightShading-Accent1"/>
-        <w:tblW w:type="auto" w:w="0"/>
-        <w:tblLook w:firstColumn="1" w:firstRow="1" w:lastColumn="0" w:lastRow="0" w:noHBand="0" w:noVBand="1" w:val="04A0"/>
-      </w:tblPr>
-      <w:tblGrid>
-        <w:gridCol w:w="3135"/>
-        <w:gridCol w:w="3135"/>
-        <w:gridCol w:w="3135"/>
-      </w:tblGrid>
-      <w:tr>
-        <w:tc>
-          <w:tcPr>
-            <w:tcW w:type="dxa" w:w="3135"/>
-          </w:tcPr>
-          <w:p>
-            <w:r>
-              <w:rPr>
-                <w:b/>
-                <w:sz w:val="18"/>
-              </w:rPr>
-              <w:t>Variable</w:t>
-            </w:r>
-          </w:p>
-        </w:tc>
-        <w:tc>
-          <w:tcPr>
-            <w:tcW w:type="dxa" w:w="3135"/>
-          </w:tcPr>
-          <w:p>
-            <w:r>
-              <w:rPr>
-                <w:b/>
-                <w:sz w:val="18"/>
-              </w:rPr>
-              <w:t>Purpose</w:t>
-            </w:r>
-          </w:p>
-        </w:tc>
-        <w:tc>
-          <w:tcPr>
-            <w:tcW w:type="dxa" w:w="3135"/>
-          </w:tcPr>
-          <w:p>
-            <w:r>
-              <w:rPr>
-                <w:b/>
-                <w:sz w:val="18"/>
-              </w:rPr>
-              <w:t>Where to get the value</w:t>
-            </w:r>
-          </w:p>
-        </w:tc>
-      </w:tr>
-      <w:tr>
-        <w:tc>
-          <w:tcPr>
-            <w:tcW w:type="dxa" w:w="3135"/>
-          </w:tcPr>
-          <w:p>
-            <w:r>
-              <w:rPr>
-                <w:sz w:val="18"/>
-              </w:rPr>
-              <w:t>PG_HOST</w:t>
-            </w:r>
-          </w:p>
-        </w:tc>
-        <w:tc>
-          <w:tcPr>
-            <w:tcW w:type="dxa" w:w="3135"/>
-          </w:tcPr>
-          <w:p>
-            <w:r>
-              <w:rPr>
-                <w:sz w:val="18"/>
-              </w:rPr>
-              <w:t>Primary PostgreSQL hostname</w:t>
-            </w:r>
-          </w:p>
-        </w:tc>
-        <w:tc>
-          <w:tcPr>
-            <w:tcW w:type="dxa" w:w="3135"/>
-          </w:tcPr>
-          <w:p>
-            <w:r>
-              <w:rPr>
-                <w:sz w:val="18"/>
-              </w:rPr>
-              <w:t>https://portal.azure.com/#@nyaaa.com/resource/subscriptions/e287db16-b6ae-415e-bd52-41c8ec5a8f08/resourceGroups/rg-nlaaroubi-sbx-eus2-001/providers/Microsoft.DBforPostgreSQL/flexibleServers/fslapp-pg/overview → Endpoint</w:t>
-            </w:r>
-          </w:p>
-        </w:tc>
-      </w:tr>
-      <w:tr>
-        <w:tc>
-          <w:tcPr>
-            <w:tcW w:type="dxa" w:w="3135"/>
-          </w:tcPr>
-          <w:p>
-            <w:r>
-              <w:rPr>
-                <w:sz w:val="18"/>
-              </w:rPr>
-              <w:t>PG_DR_HOST</w:t>
-            </w:r>
-          </w:p>
-        </w:tc>
-        <w:tc>
-          <w:tcPr>
-            <w:tcW w:type="dxa" w:w="3135"/>
-          </w:tcPr>
-          <w:p>
-            <w:r>
-              <w:rPr>
-                <w:sz w:val="18"/>
-              </w:rPr>
-              <w:t>DR PostgreSQL hostname</w:t>
-            </w:r>
-          </w:p>
-        </w:tc>
-        <w:tc>
-          <w:tcPr>
-            <w:tcW w:type="dxa" w:w="3135"/>
-          </w:tcPr>
-          <w:p>
-            <w:r>
-              <w:rPr>
-                <w:sz w:val="18"/>
-              </w:rPr>
-              <w:t>https://portal.azure.com/#@nyaaa.com/resource/subscriptions/e287db16-b6ae-415e-bd52-41c8ec5a8f08/resourceGroups/rg-nlaaroubi-sbx-eus2-001/providers/Microsoft.DBforPostgreSQL/flexibleServers/fslapp-pg-dr/overview → Endpoint</w:t>
-            </w:r>
-          </w:p>
-        </w:tc>
-      </w:tr>
-      <w:tr>
-        <w:tc>
-          <w:tcPr>
-            <w:tcW w:type="dxa" w:w="3135"/>
-          </w:tcPr>
-          <w:p>
-            <w:r>
-              <w:rPr>
-                <w:sz w:val="18"/>
-              </w:rPr>
-              <w:t>PG_DATABASE</w:t>
-            </w:r>
-          </w:p>
-        </w:tc>
-        <w:tc>
-          <w:tcPr>
-            <w:tcW w:type="dxa" w:w="3135"/>
-          </w:tcPr>
-          <w:p>
-            <w:r>
-              <w:rPr>
-                <w:sz w:val="18"/>
-              </w:rPr>
-              <w:t>Database name</w:t>
-            </w:r>
-          </w:p>
-        </w:tc>
-        <w:tc>
-          <w:tcPr>
-            <w:tcW w:type="dxa" w:w="3135"/>
-          </w:tcPr>
-          <w:p>
-            <w:r>
-              <w:rPr>
-                <w:sz w:val="18"/>
-              </w:rPr>
-              <w:t>Fixed: fslapp</w:t>
-            </w:r>
-          </w:p>
-        </w:tc>
-      </w:tr>
-      <w:tr>
-        <w:tc>
-          <w:tcPr>
-            <w:tcW w:type="dxa" w:w="3135"/>
-          </w:tcPr>
-          <w:p>
-            <w:r>
-              <w:rPr>
-                <w:sz w:val="18"/>
-              </w:rPr>
-              <w:t>PG_USER</w:t>
-            </w:r>
-          </w:p>
-        </w:tc>
-        <w:tc>
-          <w:tcPr>
-            <w:tcW w:type="dxa" w:w="3135"/>
-          </w:tcPr>
-          <w:p>
-            <w:r>
-              <w:rPr>
-                <w:sz w:val="18"/>
-              </w:rPr>
-              <w:t>MI login name</w:t>
-            </w:r>
-          </w:p>
-        </w:tc>
-        <w:tc>
-          <w:tcPr>
-            <w:tcW w:type="dxa" w:w="3135"/>
-          </w:tcPr>
-          <w:p>
-            <w:r>
-              <w:rPr>
-                <w:sz w:val="18"/>
-              </w:rPr>
-              <w:t>salespulse-nyaaa (Entra format)</w:t>
-            </w:r>
-          </w:p>
-        </w:tc>
-      </w:tr>
-      <w:tr>
-        <w:tc>
-          <w:tcPr>
-            <w:tcW w:type="dxa" w:w="3135"/>
-          </w:tcPr>
-          <w:p>
-            <w:r>
-              <w:rPr>
-                <w:sz w:val="18"/>
-              </w:rPr>
-              <w:t>PG_AUTH</w:t>
-            </w:r>
-          </w:p>
-        </w:tc>
-        <w:tc>
-          <w:tcPr>
-            <w:tcW w:type="dxa" w:w="3135"/>
-          </w:tcPr>
-          <w:p>
-            <w:r>
-              <w:rPr>
-                <w:sz w:val="18"/>
-              </w:rPr>
-              <w:t>Auth method</w:t>
-            </w:r>
-          </w:p>
-        </w:tc>
-        <w:tc>
-          <w:tcPr>
-            <w:tcW w:type="dxa" w:w="3135"/>
-          </w:tcPr>
-          <w:p>
-            <w:r>
-              <w:rPr>
-                <w:sz w:val="18"/>
-              </w:rPr>
-              <w:t>Fixed: entra</w:t>
-            </w:r>
-          </w:p>
-        </w:tc>
-      </w:tr>
-      <w:tr>
-        <w:tc>
-          <w:tcPr>
-            <w:tcW w:type="dxa" w:w="3135"/>
-          </w:tcPr>
-          <w:p>
-            <w:r>
-              <w:rPr>
-                <w:sz w:val="18"/>
-              </w:rPr>
-              <w:t>ADMIN_PIN</w:t>
-            </w:r>
-          </w:p>
-        </w:tc>
-        <w:tc>
-          <w:tcPr>
-            <w:tcW w:type="dxa" w:w="3135"/>
-          </w:tcPr>
-          <w:p>
-            <w:r>
-              <w:rPr>
-                <w:sz w:val="18"/>
-              </w:rPr>
-              <w:t>Admin panel PIN</w:t>
-            </w:r>
-          </w:p>
-        </w:tc>
-        <w:tc>
-          <w:tcPr>
-            <w:tcW w:type="dxa" w:w="3135"/>
-          </w:tcPr>
-          <w:p>
-            <w:r>
-              <w:rPr>
-                <w:sz w:val="18"/>
-              </w:rPr>
-              <w:t>Set by admin — keep in 1Password</w:t>
-            </w:r>
-          </w:p>
-        </w:tc>
-      </w:tr>
-      <w:tr>
-        <w:tc>
-          <w:tcPr>
-            <w:tcW w:type="dxa" w:w="3135"/>
-          </w:tcPr>
-          <w:p>
-            <w:r>
-              <w:rPr>
-                <w:sz w:val="18"/>
-              </w:rPr>
-              <w:t>SF_TOKEN_URL</w:t>
-            </w:r>
-          </w:p>
-        </w:tc>
-        <w:tc>
-          <w:tcPr>
-            <w:tcW w:type="dxa" w:w="3135"/>
-          </w:tcPr>
-          <w:p>
-            <w:r>
-              <w:rPr>
-                <w:sz w:val="18"/>
-              </w:rPr>
-              <w:t>Salesforce OAuth endpoint</w:t>
-            </w:r>
-          </w:p>
-        </w:tc>
-        <w:tc>
-          <w:tcPr>
-            <w:tcW w:type="dxa" w:w="3135"/>
-          </w:tcPr>
-          <w:p>
-            <w:r>
-              <w:rPr>
-                <w:sz w:val="18"/>
-              </w:rPr>
-              <w:t>From SF connected app settings</w:t>
-            </w:r>
-          </w:p>
-        </w:tc>
-      </w:tr>
-      <w:tr>
-        <w:tc>
-          <w:tcPr>
-            <w:tcW w:type="dxa" w:w="3135"/>
-          </w:tcPr>
-          <w:p>
-            <w:r>
-              <w:rPr>
-                <w:sz w:val="18"/>
-              </w:rPr>
-              <w:t>SF_CONSUMER_KEY</w:t>
-            </w:r>
-          </w:p>
-        </w:tc>
-        <w:tc>
-          <w:tcPr>
-            <w:tcW w:type="dxa" w:w="3135"/>
-          </w:tcPr>
-          <w:p>
-            <w:r>
-              <w:rPr>
-                <w:sz w:val="18"/>
-              </w:rPr>
-              <w:t>SF OAuth key</w:t>
-            </w:r>
-          </w:p>
-        </w:tc>
-        <w:tc>
-          <w:tcPr>
-            <w:tcW w:type="dxa" w:w="3135"/>
-          </w:tcPr>
-          <w:p>
-            <w:r>
-              <w:rPr>
-                <w:sz w:val="18"/>
-              </w:rPr>
-              <w:t>https://aaawcny.lightning.force.com → Setup → Connected Apps</w:t>
-            </w:r>
-          </w:p>
-        </w:tc>
-      </w:tr>
-      <w:tr>
-        <w:tc>
-          <w:tcPr>
-            <w:tcW w:type="dxa" w:w="3135"/>
-          </w:tcPr>
-          <w:p>
-            <w:r>
-              <w:rPr>
-                <w:sz w:val="18"/>
-              </w:rPr>
-              <w:t>SF_CONSUMER_SECRET</w:t>
-            </w:r>
-          </w:p>
-        </w:tc>
-        <w:tc>
-          <w:tcPr>
-            <w:tcW w:type="dxa" w:w="3135"/>
-          </w:tcPr>
-          <w:p>
-            <w:r>
-              <w:rPr>
-                <w:sz w:val="18"/>
-              </w:rPr>
-              <w:t>SF OAuth secret</w:t>
-            </w:r>
-          </w:p>
-        </w:tc>
-        <w:tc>
-          <w:tcPr>
-            <w:tcW w:type="dxa" w:w="3135"/>
-          </w:tcPr>
-          <w:p>
-            <w:r>
-              <w:rPr>
-                <w:sz w:val="18"/>
-              </w:rPr>
-              <w:t>Same as above</w:t>
-            </w:r>
-          </w:p>
-        </w:tc>
-      </w:tr>
-      <w:tr>
-        <w:tc>
-          <w:tcPr>
-            <w:tcW w:type="dxa" w:w="3135"/>
-          </w:tcPr>
-          <w:p>
-            <w:r>
-              <w:rPr>
-                <w:sz w:val="18"/>
-              </w:rPr>
-              <w:t>SF_USERNAME</w:t>
-            </w:r>
-          </w:p>
-        </w:tc>
-        <w:tc>
-          <w:tcPr>
-            <w:tcW w:type="dxa" w:w="3135"/>
-          </w:tcPr>
-          <w:p>
-            <w:r>
-              <w:rPr>
-                <w:sz w:val="18"/>
-              </w:rPr>
-              <w:t>SF API username</w:t>
-            </w:r>
-          </w:p>
-        </w:tc>
-        <w:tc>
-          <w:tcPr>
-            <w:tcW w:type="dxa" w:w="3135"/>
-          </w:tcPr>
-          <w:p>
-            <w:r>
-              <w:rPr>
-                <w:sz w:val="18"/>
-              </w:rPr>
-              <w:t>nlaaroubi@nyaaa.com (or service account)</w:t>
-            </w:r>
-          </w:p>
-        </w:tc>
-      </w:tr>
-      <w:tr>
-        <w:tc>
-          <w:tcPr>
-            <w:tcW w:type="dxa" w:w="3135"/>
-          </w:tcPr>
-          <w:p>
-            <w:r>
-              <w:rPr>
-                <w:sz w:val="18"/>
-              </w:rPr>
-              <w:t>OPENAI_API_KEY</w:t>
-            </w:r>
-          </w:p>
-        </w:tc>
-        <w:tc>
-          <w:tcPr>
-            <w:tcW w:type="dxa" w:w="3135"/>
-          </w:tcPr>
-          <w:p>
-            <w:r>
-              <w:rPr>
-                <w:sz w:val="18"/>
-              </w:rPr>
-              <w:t>GPT-4o API</w:t>
-            </w:r>
-          </w:p>
-        </w:tc>
-        <w:tc>
-          <w:tcPr>
-            <w:tcW w:type="dxa" w:w="3135"/>
-          </w:tcPr>
-          <w:p>
-            <w:r>
-              <w:rPr>
-                <w:sz w:val="18"/>
-              </w:rPr>
-              <w:t>https://platform.openai.com/api-keys</w:t>
-            </w:r>
-          </w:p>
-        </w:tc>
-      </w:tr>
-      <w:tr>
-        <w:tc>
-          <w:tcPr>
-            <w:tcW w:type="dxa" w:w="3135"/>
-          </w:tcPr>
-          <w:p>
-            <w:r>
-              <w:rPr>
-                <w:sz w:val="18"/>
-              </w:rPr>
-              <w:t>ANTHROPIC_API_KEY</w:t>
-            </w:r>
-          </w:p>
-        </w:tc>
-        <w:tc>
-          <w:tcPr>
-            <w:tcW w:type="dxa" w:w="3135"/>
-          </w:tcPr>
-          <w:p>
-            <w:r>
-              <w:rPr>
-                <w:sz w:val="18"/>
-              </w:rPr>
-              <w:t>Claude Sonnet 4.6</w:t>
-            </w:r>
-          </w:p>
-        </w:tc>
-        <w:tc>
-          <w:tcPr>
-            <w:tcW w:type="dxa" w:w="3135"/>
-          </w:tcPr>
-          <w:p>
-            <w:r>
-              <w:rPr>
-                <w:sz w:val="18"/>
-              </w:rPr>
-              <w:t>https://console.anthropic.com/account/keys</w:t>
-            </w:r>
-          </w:p>
-        </w:tc>
-      </w:tr>
-    </w:tbl>
-    <w:p/>
     <w:p>
       <w:pPr>
         <w:pStyle w:val="Heading2"/>
@@ -1877,7 +1282,7 @@
         <w:rPr>
           <w:sz w:val="22"/>
         </w:rPr>
-        <w:t>Logs = Runtime, Lookback = Last 30 minutes</w:t>
+        <w:t>Logs = Runtime,  Lookback = Last 30 minutes</w:t>
       </w:r>
     </w:p>
     <w:p>
@@ -1888,56 +1293,7 @@
         <w:rPr>
           <w:sz w:val="22"/>
         </w:rPr>
-        <w:t>HTTP 200 = healthy.  500/502/503 = errors.  Look for Python Traceback lines.</w:t>
-      </w:r>
-    </w:p>
-    <w:p>
-      <w:r>
-        <w:drawing>
-          <wp:inline xmlns:a="http://schemas.openxmlformats.org/drawingml/2006/main" xmlns:pic="http://schemas.openxmlformats.org/drawingml/2006/picture">
-            <wp:extent cx="5943600" cy="2848637"/>
-            <wp:docPr id="5" name="Picture 5"/>
-            <wp:cNvGraphicFramePr>
-              <a:graphicFrameLocks noChangeAspect="1"/>
-            </wp:cNvGraphicFramePr>
-            <a:graphic>
-              <a:graphicData uri="http://schemas.openxmlformats.org/drawingml/2006/picture">
-                <pic:pic>
-                  <pic:nvPicPr>
-                    <pic:cNvPr id="0" name="01_appservice_overview.png"/>
-                    <pic:cNvPicPr/>
-                  </pic:nvPicPr>
-                  <pic:blipFill>
-                    <a:blip r:embed="rId10"/>
-                    <a:stretch>
-                      <a:fillRect/>
-                    </a:stretch>
-                  </pic:blipFill>
-                  <pic:spPr>
-                    <a:xfrm>
-                      <a:off x="0" y="0"/>
-                      <a:ext cx="5943600" cy="2848637"/>
-                    </a:xfrm>
-                    <a:prstGeom prst="rect"/>
-                  </pic:spPr>
-                </pic:pic>
-              </a:graphicData>
-            </a:graphic>
-          </wp:inline>
-        </w:drawing>
-      </w:r>
-    </w:p>
-    <w:p>
-      <w:pPr>
-        <w:jc w:val="center"/>
-      </w:pPr>
-      <w:r>
-        <w:rPr>
-          <w:i/>
-          <w:color w:val="555555"/>
-          <w:sz w:val="18"/>
-        </w:rPr>
-        <w:t>Log Stream — live HTTP requests and errors. All 200 = healthy.</w:t>
+        <w:t>Lines with 500 or 'Traceback' = error.</w:t>
       </w:r>
     </w:p>
     <w:p>
@@ -1950,14 +1306,6 @@
       </w:r>
     </w:p>
     <w:p>
-      <w:r>
-        <w:rPr>
-          <w:sz w:val="22"/>
-        </w:rPr>
-        <w:t>Primary is Basic B2 (2 vCPU, 3.5 GB). DR is P1v3 Premium. Scale primary up to P1v3 if traffic or load increases.</w:t>
-      </w:r>
-    </w:p>
-    <w:p>
       <w:pPr>
         <w:pStyle w:val="ListNumber"/>
       </w:pPr>
@@ -1965,7 +1313,7 @@
         <w:rPr>
           <w:sz w:val="22"/>
         </w:rPr>
-        <w:t xml:space="preserve">Scale up: </w:t>
+        <w:t xml:space="preserve">Scale UP: </w:t>
       </w:r>
       <w:r>
         <w:rPr>
@@ -1979,56 +1327,25 @@
         <w:rPr>
           <w:sz w:val="22"/>
         </w:rPr>
-        <w:t xml:space="preserve">  →  → select tier → click Select (no restart needed)</w:t>
+        <w:t xml:space="preserve">  →  → select tier → click Select</w:t>
       </w:r>
     </w:p>
     <w:p>
       <w:r>
-        <w:drawing>
-          <wp:inline xmlns:a="http://schemas.openxmlformats.org/drawingml/2006/main" xmlns:pic="http://schemas.openxmlformats.org/drawingml/2006/picture">
-            <wp:extent cx="5943600" cy="2848637"/>
-            <wp:docPr id="6" name="Picture 6"/>
-            <wp:cNvGraphicFramePr>
-              <a:graphicFrameLocks noChangeAspect="1"/>
-            </wp:cNvGraphicFramePr>
-            <a:graphic>
-              <a:graphicData uri="http://schemas.openxmlformats.org/drawingml/2006/picture">
-                <pic:pic>
-                  <pic:nvPicPr>
-                    <pic:cNvPr id="0" name="01_appservice_overview.png"/>
-                    <pic:cNvPicPr/>
-                  </pic:nvPicPr>
-                  <pic:blipFill>
-                    <a:blip r:embed="rId10"/>
-                    <a:stretch>
-                      <a:fillRect/>
-                    </a:stretch>
-                  </pic:blipFill>
-                  <pic:spPr>
-                    <a:xfrm>
-                      <a:off x="0" y="0"/>
-                      <a:ext cx="5943600" cy="2848637"/>
-                    </a:xfrm>
-                    <a:prstGeom prst="rect"/>
-                  </pic:spPr>
-                </pic:pic>
-              </a:graphicData>
-            </a:graphic>
-          </wp:inline>
-        </w:drawing>
+        <w:rPr>
+          <w:sz w:val="22"/>
+        </w:rPr>
+        <w:t>Current tier: Basic B2 (2 vCPU, 3.5 GB RAM). Scale to P1v3 or higher for production load.</w:t>
       </w:r>
     </w:p>
     <w:p>
-      <w:pPr>
-        <w:jc w:val="center"/>
-      </w:pPr>
       <w:r>
         <w:rPr>
-          <w:i/>
-          <w:color w:val="555555"/>
-          <w:sz w:val="18"/>
+          <w:b/>
+          <w:color w:val="FF8C00"/>
+          <w:sz w:val="20"/>
         </w:rPr>
-        <w:t>Scale up tiers. Select P1V3 for production SLA (99.95%). Click Select to apply.</w:t>
+        <w:t>⚠  Basic B2 does not support VNet integration or auto-scale. Upgrade to P1v3 for those features.</w:t>
       </w:r>
     </w:p>
     <w:p>
@@ -2048,7 +1365,7 @@
         <w:rPr>
           <w:sz w:val="22"/>
         </w:rPr>
-        <w:t xml:space="preserve">Monitor deployment: </w:t>
+        <w:t xml:space="preserve">Monitor: </w:t>
       </w:r>
       <w:r>
         <w:rPr>
@@ -2061,84 +1378,15 @@
     </w:p>
     <w:p>
       <w:pPr>
-        <w:pStyle w:val="ListNumber"/>
+        <w:ind w:left="432"/>
       </w:pPr>
       <w:r>
         <w:rPr>
-          <w:sz w:val="22"/>
-        </w:rPr>
-        <w:t>Push to GitHub main branch → Azure builds automatically (~3 min)</w:t>
-      </w:r>
-    </w:p>
-    <w:p>
-      <w:pPr>
-        <w:pStyle w:val="ListNumber"/>
-      </w:pPr>
-      <w:r>
-        <w:rPr>
-          <w:sz w:val="22"/>
-        </w:rPr>
-        <w:t>Deployment Center shows Last deployment = Success (green) or Failed (red)</w:t>
-      </w:r>
-    </w:p>
-    <w:p>
-      <w:pPr>
-        <w:pStyle w:val="ListNumber"/>
-      </w:pPr>
-      <w:r>
-        <w:rPr>
-          <w:sz w:val="22"/>
-        </w:rPr>
-        <w:t>Click View logs on any row to see full Oryx build output</w:t>
-      </w:r>
-    </w:p>
-    <w:p>
-      <w:r>
-        <w:drawing>
-          <wp:inline xmlns:a="http://schemas.openxmlformats.org/drawingml/2006/main" xmlns:pic="http://schemas.openxmlformats.org/drawingml/2006/picture">
-            <wp:extent cx="5943600" cy="2848637"/>
-            <wp:docPr id="7" name="Picture 7"/>
-            <wp:cNvGraphicFramePr>
-              <a:graphicFrameLocks noChangeAspect="1"/>
-            </wp:cNvGraphicFramePr>
-            <a:graphic>
-              <a:graphicData uri="http://schemas.openxmlformats.org/drawingml/2006/picture">
-                <pic:pic>
-                  <pic:nvPicPr>
-                    <pic:cNvPr id="0" name="01_appservice_overview.png"/>
-                    <pic:cNvPicPr/>
-                  </pic:nvPicPr>
-                  <pic:blipFill>
-                    <a:blip r:embed="rId10"/>
-                    <a:stretch>
-                      <a:fillRect/>
-                    </a:stretch>
-                  </pic:blipFill>
-                  <pic:spPr>
-                    <a:xfrm>
-                      <a:off x="0" y="0"/>
-                      <a:ext cx="5943600" cy="2848637"/>
-                    </a:xfrm>
-                    <a:prstGeom prst="rect"/>
-                  </pic:spPr>
-                </pic:pic>
-              </a:graphicData>
-            </a:graphic>
-          </wp:inline>
-        </w:drawing>
-      </w:r>
-    </w:p>
-    <w:p>
-      <w:pPr>
-        <w:jc w:val="center"/>
-      </w:pPr>
-      <w:r>
-        <w:rPr>
-          <w:i/>
-          <w:color w:val="555555"/>
+          <w:rFonts w:ascii="Courier New" w:hAnsi="Courier New"/>
+          <w:color w:val="1A1A1A"/>
           <w:sz w:val="18"/>
         </w:rPr>
-        <w:t>Deployment Center — build history and logs per GitHub push.</w:t>
+        <w:t>git push origin main  # build takes ~3 minutes</w:t>
       </w:r>
     </w:p>
     <w:p>
@@ -2152,7 +1400,7 @@
         <w:jc w:val="left"/>
       </w:pPr>
       <w:r>
-        <w:t>4. Managed Identity — Passwordless DB Auth</w:t>
+        <w:t>4. Environment Variables — Complete Reference</w:t>
       </w:r>
     </w:p>
     <w:p>
@@ -2160,7 +1408,1825 @@
         <w:rPr>
           <w:sz w:val="22"/>
         </w:rPr>
-        <w:t>salespulse-nyaaa uses system-assigned Managed Identity to authenticate to PostgreSQL. No password is stored in configuration. Status must remain ON.</w:t>
+        <w:t>All secrets and config are App Settings on the App Service. SalesPulse and FSLAPP share many of the same external services (Salesforce, AI, Google Maps) but each app has its own App Service with its own copy of the settings.</w:t>
+      </w:r>
+    </w:p>
+    <w:p>
+      <w:pPr>
+        <w:pStyle w:val="ListNumber"/>
+      </w:pPr>
+      <w:r>
+        <w:rPr>
+          <w:sz w:val="22"/>
+        </w:rPr>
+        <w:t xml:space="preserve">Set variables at: </w:t>
+      </w:r>
+      <w:r>
+        <w:rPr>
+          <w:b/>
+          <w:color w:val="005ACC"/>
+          <w:sz w:val="20"/>
+        </w:rPr>
+        <w:t>https://portal.azure.com/#@nyaaa.com/resource/subscriptions/e287db16-b6ae-415e-bd52-41c8ec5a8f08/resourceGroups/rg-nlaaroubi-sbx-eus2-001/providers/Microsoft.Web/sites/salespulse-nyaaa/environmentVariablesAppSettings</w:t>
+      </w:r>
+    </w:p>
+    <w:p>
+      <w:pPr>
+        <w:pStyle w:val="ListNumber"/>
+      </w:pPr>
+      <w:r>
+        <w:rPr>
+          <w:sz w:val="22"/>
+        </w:rPr>
+        <w:t xml:space="preserve">DR app variables at: </w:t>
+      </w:r>
+      <w:r>
+        <w:rPr>
+          <w:b/>
+          <w:color w:val="005ACC"/>
+          <w:sz w:val="20"/>
+        </w:rPr>
+        <w:t>https://portal.azure.com/#@nyaaa.com/resource/subscriptions/e287db16-b6ae-415e-bd52-41c8ec5a8f08/resourceGroups/rg-nlaaroubi-sbx-eus2-001/providers/Microsoft.Web/sites/salespulse-nyaaa-dr/environmentVariablesAppSettings</w:t>
+      </w:r>
+      <w:r>
+        <w:rPr>
+          <w:sz w:val="22"/>
+        </w:rPr>
+        <w:t xml:space="preserve">  →  → must mirror primary exactly</w:t>
+      </w:r>
+    </w:p>
+    <w:p/>
+    <w:p>
+      <w:pPr>
+        <w:pStyle w:val="Heading2"/>
+        <w:jc w:val="left"/>
+      </w:pPr>
+      <w:r>
+        <w:t>4.1  Admin &amp; Security</w:t>
+      </w:r>
+    </w:p>
+    <w:tbl>
+      <w:tblPr>
+        <w:tblStyle w:val="LightShading-Accent1"/>
+        <w:tblW w:type="auto" w:w="0"/>
+        <w:tblLook w:firstColumn="1" w:firstRow="1" w:lastColumn="0" w:lastRow="0" w:noHBand="0" w:noVBand="1" w:val="04A0"/>
+      </w:tblPr>
+      <w:tblGrid>
+        <w:gridCol w:w="1994"/>
+        <w:gridCol w:w="1994"/>
+        <w:gridCol w:w="1994"/>
+        <w:gridCol w:w="1994"/>
+        <w:gridCol w:w="1994"/>
+      </w:tblGrid>
+      <w:tr>
+        <w:tc>
+          <w:tcPr>
+            <w:tcW w:type="dxa" w:w="1994"/>
+          </w:tcPr>
+          <w:p>
+            <w:r>
+              <w:rPr>
+                <w:b/>
+                <w:sz w:val="16"/>
+              </w:rPr>
+              <w:t>Variable</w:t>
+            </w:r>
+          </w:p>
+        </w:tc>
+        <w:tc>
+          <w:tcPr>
+            <w:tcW w:type="dxa" w:w="1994"/>
+          </w:tcPr>
+          <w:p>
+            <w:r>
+              <w:rPr>
+                <w:b/>
+                <w:sz w:val="16"/>
+              </w:rPr>
+              <w:t>Required</w:t>
+            </w:r>
+          </w:p>
+        </w:tc>
+        <w:tc>
+          <w:tcPr>
+            <w:tcW w:type="dxa" w:w="1994"/>
+          </w:tcPr>
+          <w:p>
+            <w:r>
+              <w:rPr>
+                <w:b/>
+                <w:sz w:val="16"/>
+              </w:rPr>
+              <w:t>Purpose — What the app uses it for</w:t>
+            </w:r>
+          </w:p>
+        </w:tc>
+        <w:tc>
+          <w:tcPr>
+            <w:tcW w:type="dxa" w:w="1994"/>
+          </w:tcPr>
+          <w:p>
+            <w:r>
+              <w:rPr>
+                <w:b/>
+                <w:sz w:val="16"/>
+              </w:rPr>
+              <w:t>Format / Example Value</w:t>
+            </w:r>
+          </w:p>
+        </w:tc>
+        <w:tc>
+          <w:tcPr>
+            <w:tcW w:type="dxa" w:w="1994"/>
+          </w:tcPr>
+          <w:p>
+            <w:r>
+              <w:rPr>
+                <w:b/>
+                <w:sz w:val="16"/>
+              </w:rPr>
+              <w:t>Where to get it</w:t>
+            </w:r>
+          </w:p>
+        </w:tc>
+      </w:tr>
+      <w:tr>
+        <w:tc>
+          <w:tcPr>
+            <w:tcW w:type="dxa" w:w="1994"/>
+          </w:tcPr>
+          <w:p>
+            <w:r>
+              <w:rPr>
+                <w:b/>
+                <w:sz w:val="16"/>
+              </w:rPr>
+              <w:t>ADMIN_PIN</w:t>
+            </w:r>
+          </w:p>
+        </w:tc>
+        <w:tc>
+          <w:tcPr>
+            <w:tcW w:type="dxa" w:w="1994"/>
+          </w:tcPr>
+          <w:p>
+            <w:r>
+              <w:rPr>
+                <w:b/>
+                <w:color w:val="CC0000"/>
+                <w:sz w:val="16"/>
+              </w:rPr>
+              <w:t>YES</w:t>
+            </w:r>
+          </w:p>
+        </w:tc>
+        <w:tc>
+          <w:tcPr>
+            <w:tcW w:type="dxa" w:w="1994"/>
+          </w:tcPr>
+          <w:p>
+            <w:r>
+              <w:rPr>
+                <w:sz w:val="16"/>
+              </w:rPr>
+              <w:t>4-digit PIN protecting the /admin panel. Without this, no one can log in.</w:t>
+            </w:r>
+          </w:p>
+        </w:tc>
+        <w:tc>
+          <w:tcPr>
+            <w:tcW w:type="dxa" w:w="1994"/>
+          </w:tcPr>
+          <w:p>
+            <w:r>
+              <w:rPr>
+                <w:sz w:val="16"/>
+              </w:rPr>
+              <w:t>4 digits. Example: 5183</w:t>
+            </w:r>
+          </w:p>
+        </w:tc>
+        <w:tc>
+          <w:tcPr>
+            <w:tcW w:type="dxa" w:w="1994"/>
+          </w:tcPr>
+          <w:p>
+            <w:r>
+              <w:rPr>
+                <w:sz w:val="16"/>
+              </w:rPr>
+              <w:t>Choose any 4-digit PIN. Can differ from FSLAPP's PIN. Store in 1Password.</w:t>
+            </w:r>
+          </w:p>
+        </w:tc>
+      </w:tr>
+    </w:tbl>
+    <w:p/>
+    <w:p>
+      <w:pPr>
+        <w:pStyle w:val="Heading2"/>
+        <w:jc w:val="left"/>
+      </w:pPr>
+      <w:r>
+        <w:t>4.2  PostgreSQL Database Connection</w:t>
+      </w:r>
+    </w:p>
+    <w:p>
+      <w:r>
+        <w:rPr>
+          <w:sz w:val="22"/>
+        </w:rPr>
+        <w:t>SalesPulse uses the same shared fslapp-pg server as FSLAPP, but only accesses the 'sales' schema.</w:t>
+      </w:r>
+    </w:p>
+    <w:tbl>
+      <w:tblPr>
+        <w:tblStyle w:val="LightShading-Accent1"/>
+        <w:tblW w:type="auto" w:w="0"/>
+        <w:tblLook w:firstColumn="1" w:firstRow="1" w:lastColumn="0" w:lastRow="0" w:noHBand="0" w:noVBand="1" w:val="04A0"/>
+      </w:tblPr>
+      <w:tblGrid>
+        <w:gridCol w:w="1994"/>
+        <w:gridCol w:w="1994"/>
+        <w:gridCol w:w="1994"/>
+        <w:gridCol w:w="1994"/>
+        <w:gridCol w:w="1994"/>
+      </w:tblGrid>
+      <w:tr>
+        <w:tc>
+          <w:tcPr>
+            <w:tcW w:type="dxa" w:w="1994"/>
+          </w:tcPr>
+          <w:p>
+            <w:r>
+              <w:rPr>
+                <w:b/>
+                <w:sz w:val="16"/>
+              </w:rPr>
+              <w:t>Variable</w:t>
+            </w:r>
+          </w:p>
+        </w:tc>
+        <w:tc>
+          <w:tcPr>
+            <w:tcW w:type="dxa" w:w="1994"/>
+          </w:tcPr>
+          <w:p>
+            <w:r>
+              <w:rPr>
+                <w:b/>
+                <w:sz w:val="16"/>
+              </w:rPr>
+              <w:t>Required</w:t>
+            </w:r>
+          </w:p>
+        </w:tc>
+        <w:tc>
+          <w:tcPr>
+            <w:tcW w:type="dxa" w:w="1994"/>
+          </w:tcPr>
+          <w:p>
+            <w:r>
+              <w:rPr>
+                <w:b/>
+                <w:sz w:val="16"/>
+              </w:rPr>
+              <w:t>Purpose — What the app uses it for</w:t>
+            </w:r>
+          </w:p>
+        </w:tc>
+        <w:tc>
+          <w:tcPr>
+            <w:tcW w:type="dxa" w:w="1994"/>
+          </w:tcPr>
+          <w:p>
+            <w:r>
+              <w:rPr>
+                <w:b/>
+                <w:sz w:val="16"/>
+              </w:rPr>
+              <w:t>Format / Example Value</w:t>
+            </w:r>
+          </w:p>
+        </w:tc>
+        <w:tc>
+          <w:tcPr>
+            <w:tcW w:type="dxa" w:w="1994"/>
+          </w:tcPr>
+          <w:p>
+            <w:r>
+              <w:rPr>
+                <w:b/>
+                <w:sz w:val="16"/>
+              </w:rPr>
+              <w:t>Where to get it</w:t>
+            </w:r>
+          </w:p>
+        </w:tc>
+      </w:tr>
+      <w:tr>
+        <w:tc>
+          <w:tcPr>
+            <w:tcW w:type="dxa" w:w="1994"/>
+          </w:tcPr>
+          <w:p>
+            <w:r>
+              <w:rPr>
+                <w:b/>
+                <w:sz w:val="16"/>
+              </w:rPr>
+              <w:t>FSLAPP_PG_HOST</w:t>
+            </w:r>
+          </w:p>
+        </w:tc>
+        <w:tc>
+          <w:tcPr>
+            <w:tcW w:type="dxa" w:w="1994"/>
+          </w:tcPr>
+          <w:p>
+            <w:r>
+              <w:rPr>
+                <w:b/>
+                <w:color w:val="CC0000"/>
+                <w:sz w:val="16"/>
+              </w:rPr>
+              <w:t>YES</w:t>
+            </w:r>
+          </w:p>
+        </w:tc>
+        <w:tc>
+          <w:tcPr>
+            <w:tcW w:type="dxa" w:w="1994"/>
+          </w:tcPr>
+          <w:p>
+            <w:r>
+              <w:rPr>
+                <w:sz w:val="16"/>
+              </w:rPr>
+              <w:t>Primary PostgreSQL hostname. Same server as FSLAPP — fslapp-pg. SalesPulse reads/writes only to the 'sales' schema within this server.</w:t>
+            </w:r>
+          </w:p>
+        </w:tc>
+        <w:tc>
+          <w:tcPr>
+            <w:tcW w:type="dxa" w:w="1994"/>
+          </w:tcPr>
+          <w:p>
+            <w:r>
+              <w:rPr>
+                <w:sz w:val="16"/>
+              </w:rPr>
+              <w:t>Example: fslapp-pg.postgres.database.azure.com</w:t>
+            </w:r>
+          </w:p>
+        </w:tc>
+        <w:tc>
+          <w:tcPr>
+            <w:tcW w:type="dxa" w:w="1994"/>
+          </w:tcPr>
+          <w:p>
+            <w:r>
+              <w:rPr>
+                <w:sz w:val="16"/>
+              </w:rPr>
+              <w:t>Open: https://portal.azure.com/#@nyaaa.com/resource/subscriptions/e287db16-b6ae-415e-bd52-41c8ec5a8f08/resourceGroups/rg-nlaaroubi-sbx-eus2-001/providers/Microsoft.DBforPostgreSQL/flexibleServers/fslapp-pg/overview → copy Server name. Same value as FSLAPP — it's the same shared server.</w:t>
+            </w:r>
+          </w:p>
+        </w:tc>
+      </w:tr>
+      <w:tr>
+        <w:tc>
+          <w:tcPr>
+            <w:tcW w:type="dxa" w:w="1994"/>
+          </w:tcPr>
+          <w:p>
+            <w:r>
+              <w:rPr>
+                <w:b/>
+                <w:sz w:val="16"/>
+              </w:rPr>
+              <w:t>FSLAPP_PG_DR_HOST</w:t>
+            </w:r>
+          </w:p>
+        </w:tc>
+        <w:tc>
+          <w:tcPr>
+            <w:tcW w:type="dxa" w:w="1994"/>
+          </w:tcPr>
+          <w:p>
+            <w:r>
+              <w:rPr>
+                <w:b/>
+                <w:color w:val="CC0000"/>
+                <w:sz w:val="16"/>
+              </w:rPr>
+              <w:t>YES</w:t>
+            </w:r>
+          </w:p>
+        </w:tc>
+        <w:tc>
+          <w:tcPr>
+            <w:tcW w:type="dxa" w:w="1994"/>
+          </w:tcPr>
+          <w:p>
+            <w:r>
+              <w:rPr>
+                <w:sz w:val="16"/>
+              </w:rPr>
+              <w:t>DR PostgreSQL hostname — same shared server as FSLAPP DR.</w:t>
+            </w:r>
+          </w:p>
+        </w:tc>
+        <w:tc>
+          <w:tcPr>
+            <w:tcW w:type="dxa" w:w="1994"/>
+          </w:tcPr>
+          <w:p>
+            <w:r>
+              <w:rPr>
+                <w:sz w:val="16"/>
+              </w:rPr>
+              <w:t>Example: fslapp-pg-dr.postgres.database.azure.com</w:t>
+            </w:r>
+          </w:p>
+        </w:tc>
+        <w:tc>
+          <w:tcPr>
+            <w:tcW w:type="dxa" w:w="1994"/>
+          </w:tcPr>
+          <w:p>
+            <w:r>
+              <w:rPr>
+                <w:sz w:val="16"/>
+              </w:rPr>
+              <w:t>Open: https://portal.azure.com/#@nyaaa.com/resource/subscriptions/e287db16-b6ae-415e-bd52-41c8ec5a8f08/resourceGroups/rg-nlaaroubi-sbx-eus2-001/providers/Microsoft.DBforPostgreSQL/flexibleServers/fslapp-pg-dr/overview → copy Server name.</w:t>
+            </w:r>
+          </w:p>
+        </w:tc>
+      </w:tr>
+      <w:tr>
+        <w:tc>
+          <w:tcPr>
+            <w:tcW w:type="dxa" w:w="1994"/>
+          </w:tcPr>
+          <w:p>
+            <w:r>
+              <w:rPr>
+                <w:b/>
+                <w:sz w:val="16"/>
+              </w:rPr>
+              <w:t>FSLAPP_PG_DATABASE</w:t>
+            </w:r>
+          </w:p>
+        </w:tc>
+        <w:tc>
+          <w:tcPr>
+            <w:tcW w:type="dxa" w:w="1994"/>
+          </w:tcPr>
+          <w:p>
+            <w:r>
+              <w:rPr>
+                <w:b/>
+                <w:color w:val="CC0000"/>
+                <w:sz w:val="16"/>
+              </w:rPr>
+              <w:t>YES</w:t>
+            </w:r>
+          </w:p>
+        </w:tc>
+        <w:tc>
+          <w:tcPr>
+            <w:tcW w:type="dxa" w:w="1994"/>
+          </w:tcPr>
+          <w:p>
+            <w:r>
+              <w:rPr>
+                <w:sz w:val="16"/>
+              </w:rPr>
+              <w:t>Database name. Same as FSLAPP — all schemas share one database.</w:t>
+            </w:r>
+          </w:p>
+        </w:tc>
+        <w:tc>
+          <w:tcPr>
+            <w:tcW w:type="dxa" w:w="1994"/>
+          </w:tcPr>
+          <w:p>
+            <w:r>
+              <w:rPr>
+                <w:sz w:val="16"/>
+              </w:rPr>
+              <w:t>Fixed value: fslapp</w:t>
+            </w:r>
+          </w:p>
+        </w:tc>
+        <w:tc>
+          <w:tcPr>
+            <w:tcW w:type="dxa" w:w="1994"/>
+          </w:tcPr>
+          <w:p>
+            <w:r>
+              <w:rPr>
+                <w:sz w:val="16"/>
+              </w:rPr>
+              <w:t>Fixed — always 'fslapp'.</w:t>
+            </w:r>
+          </w:p>
+        </w:tc>
+      </w:tr>
+      <w:tr>
+        <w:tc>
+          <w:tcPr>
+            <w:tcW w:type="dxa" w:w="1994"/>
+          </w:tcPr>
+          <w:p>
+            <w:r>
+              <w:rPr>
+                <w:b/>
+                <w:sz w:val="16"/>
+              </w:rPr>
+              <w:t>FSLAPP_PG_USER</w:t>
+            </w:r>
+          </w:p>
+        </w:tc>
+        <w:tc>
+          <w:tcPr>
+            <w:tcW w:type="dxa" w:w="1994"/>
+          </w:tcPr>
+          <w:p>
+            <w:r>
+              <w:rPr>
+                <w:b/>
+                <w:color w:val="CC0000"/>
+                <w:sz w:val="16"/>
+              </w:rPr>
+              <w:t>YES</w:t>
+            </w:r>
+          </w:p>
+        </w:tc>
+        <w:tc>
+          <w:tcPr>
+            <w:tcW w:type="dxa" w:w="1994"/>
+          </w:tcPr>
+          <w:p>
+            <w:r>
+              <w:rPr>
+                <w:sz w:val="16"/>
+              </w:rPr>
+              <w:t>The Managed Identity name this App Service presents when connecting to PostgreSQL. Different from FSLAPP — this is the salespulse-nyaaa identity.</w:t>
+            </w:r>
+          </w:p>
+        </w:tc>
+        <w:tc>
+          <w:tcPr>
+            <w:tcW w:type="dxa" w:w="1994"/>
+          </w:tcPr>
+          <w:p>
+            <w:r>
+              <w:rPr>
+                <w:sz w:val="16"/>
+              </w:rPr>
+              <w:t>App Service name: salespulse-nyaaa</w:t>
+            </w:r>
+          </w:p>
+        </w:tc>
+        <w:tc>
+          <w:tcPr>
+            <w:tcW w:type="dxa" w:w="1994"/>
+          </w:tcPr>
+          <w:p>
+            <w:r>
+              <w:rPr>
+                <w:sz w:val="16"/>
+              </w:rPr>
+              <w:t>Open: https://portal.azure.com/#@nyaaa.com/resource/subscriptions/e287db16-b6ae-415e-bd52-41c8ec5a8f08/resourceGroups/rg-nlaaroubi-sbx-eus2-001/providers/Microsoft.Web/sites/salespulse-nyaaa/msi — the 'Name' under System Assigned is the value.</w:t>
+            </w:r>
+          </w:p>
+        </w:tc>
+      </w:tr>
+      <w:tr>
+        <w:tc>
+          <w:tcPr>
+            <w:tcW w:type="dxa" w:w="1994"/>
+          </w:tcPr>
+          <w:p>
+            <w:r>
+              <w:rPr>
+                <w:b/>
+                <w:sz w:val="16"/>
+              </w:rPr>
+              <w:t>FSLAPP_PG_AUTH</w:t>
+            </w:r>
+          </w:p>
+        </w:tc>
+        <w:tc>
+          <w:tcPr>
+            <w:tcW w:type="dxa" w:w="1994"/>
+          </w:tcPr>
+          <w:p>
+            <w:r>
+              <w:rPr>
+                <w:b/>
+                <w:color w:val="CC0000"/>
+                <w:sz w:val="16"/>
+              </w:rPr>
+              <w:t>YES</w:t>
+            </w:r>
+          </w:p>
+        </w:tc>
+        <w:tc>
+          <w:tcPr>
+            <w:tcW w:type="dxa" w:w="1994"/>
+          </w:tcPr>
+          <w:p>
+            <w:r>
+              <w:rPr>
+                <w:sz w:val="16"/>
+              </w:rPr>
+              <w:t>Authentication method. Must be 'entra' for Managed Identity.</w:t>
+            </w:r>
+          </w:p>
+        </w:tc>
+        <w:tc>
+          <w:tcPr>
+            <w:tcW w:type="dxa" w:w="1994"/>
+          </w:tcPr>
+          <w:p>
+            <w:r>
+              <w:rPr>
+                <w:sz w:val="16"/>
+              </w:rPr>
+              <w:t>Fixed value: entra</w:t>
+            </w:r>
+          </w:p>
+        </w:tc>
+        <w:tc>
+          <w:tcPr>
+            <w:tcW w:type="dxa" w:w="1994"/>
+          </w:tcPr>
+          <w:p>
+            <w:r>
+              <w:rPr>
+                <w:sz w:val="16"/>
+              </w:rPr>
+              <w:t>Fixed — always 'entra'.</w:t>
+            </w:r>
+          </w:p>
+        </w:tc>
+      </w:tr>
+      <w:tr>
+        <w:tc>
+          <w:tcPr>
+            <w:tcW w:type="dxa" w:w="1994"/>
+          </w:tcPr>
+          <w:p>
+            <w:r>
+              <w:rPr>
+                <w:b/>
+                <w:sz w:val="16"/>
+              </w:rPr>
+              <w:t>FSLAPP_PG_SCHEMA</w:t>
+            </w:r>
+          </w:p>
+        </w:tc>
+        <w:tc>
+          <w:tcPr>
+            <w:tcW w:type="dxa" w:w="1994"/>
+          </w:tcPr>
+          <w:p>
+            <w:r>
+              <w:rPr>
+                <w:sz w:val="16"/>
+              </w:rPr>
+              <w:t>no</w:t>
+            </w:r>
+          </w:p>
+        </w:tc>
+        <w:tc>
+          <w:tcPr>
+            <w:tcW w:type="dxa" w:w="1994"/>
+          </w:tcPr>
+          <w:p>
+            <w:r>
+              <w:rPr>
+                <w:sz w:val="16"/>
+              </w:rPr>
+              <w:t>Default schema. SalesPulse uses the 'sales' schema.</w:t>
+            </w:r>
+          </w:p>
+        </w:tc>
+        <w:tc>
+          <w:tcPr>
+            <w:tcW w:type="dxa" w:w="1994"/>
+          </w:tcPr>
+          <w:p>
+            <w:r>
+              <w:rPr>
+                <w:sz w:val="16"/>
+              </w:rPr>
+              <w:t>Value: sales</w:t>
+            </w:r>
+          </w:p>
+        </w:tc>
+        <w:tc>
+          <w:tcPr>
+            <w:tcW w:type="dxa" w:w="1994"/>
+          </w:tcPr>
+          <w:p>
+            <w:r>
+              <w:rPr>
+                <w:sz w:val="16"/>
+              </w:rPr>
+              <w:t>Set to 'sales' for SalesPulse.</w:t>
+            </w:r>
+          </w:p>
+        </w:tc>
+      </w:tr>
+    </w:tbl>
+    <w:p/>
+    <w:p>
+      <w:pPr>
+        <w:pStyle w:val="Heading2"/>
+        <w:jc w:val="left"/>
+      </w:pPr>
+      <w:r>
+        <w:t>4.3  Salesforce API</w:t>
+      </w:r>
+    </w:p>
+    <w:p>
+      <w:r>
+        <w:rPr>
+          <w:sz w:val="22"/>
+        </w:rPr>
+        <w:t>SalesPulse uses the same Salesforce org as FSLAPP to read opportunities, accounts, and membership data. Use the same Connected App credentials.</w:t>
+      </w:r>
+    </w:p>
+    <w:p>
+      <w:r>
+        <w:rPr>
+          <w:b/>
+          <w:color w:val="0078D4"/>
+          <w:sz w:val="20"/>
+        </w:rPr>
+        <w:t>ℹ  Find credentials at: https://aaawcny.lightning.force.com/lightning/setup/ConnectedApplication/home → 'FSLAPP API' Connected App → Manage Consumer Details</w:t>
+      </w:r>
+    </w:p>
+    <w:tbl>
+      <w:tblPr>
+        <w:tblStyle w:val="LightShading-Accent1"/>
+        <w:tblW w:type="auto" w:w="0"/>
+        <w:tblLook w:firstColumn="1" w:firstRow="1" w:lastColumn="0" w:lastRow="0" w:noHBand="0" w:noVBand="1" w:val="04A0"/>
+      </w:tblPr>
+      <w:tblGrid>
+        <w:gridCol w:w="1994"/>
+        <w:gridCol w:w="1994"/>
+        <w:gridCol w:w="1994"/>
+        <w:gridCol w:w="1994"/>
+        <w:gridCol w:w="1994"/>
+      </w:tblGrid>
+      <w:tr>
+        <w:tc>
+          <w:tcPr>
+            <w:tcW w:type="dxa" w:w="1994"/>
+          </w:tcPr>
+          <w:p>
+            <w:r>
+              <w:rPr>
+                <w:b/>
+                <w:sz w:val="16"/>
+              </w:rPr>
+              <w:t>Variable</w:t>
+            </w:r>
+          </w:p>
+        </w:tc>
+        <w:tc>
+          <w:tcPr>
+            <w:tcW w:type="dxa" w:w="1994"/>
+          </w:tcPr>
+          <w:p>
+            <w:r>
+              <w:rPr>
+                <w:b/>
+                <w:sz w:val="16"/>
+              </w:rPr>
+              <w:t>Required</w:t>
+            </w:r>
+          </w:p>
+        </w:tc>
+        <w:tc>
+          <w:tcPr>
+            <w:tcW w:type="dxa" w:w="1994"/>
+          </w:tcPr>
+          <w:p>
+            <w:r>
+              <w:rPr>
+                <w:b/>
+                <w:sz w:val="16"/>
+              </w:rPr>
+              <w:t>Purpose — What the app uses it for</w:t>
+            </w:r>
+          </w:p>
+        </w:tc>
+        <w:tc>
+          <w:tcPr>
+            <w:tcW w:type="dxa" w:w="1994"/>
+          </w:tcPr>
+          <w:p>
+            <w:r>
+              <w:rPr>
+                <w:b/>
+                <w:sz w:val="16"/>
+              </w:rPr>
+              <w:t>Format / Example Value</w:t>
+            </w:r>
+          </w:p>
+        </w:tc>
+        <w:tc>
+          <w:tcPr>
+            <w:tcW w:type="dxa" w:w="1994"/>
+          </w:tcPr>
+          <w:p>
+            <w:r>
+              <w:rPr>
+                <w:b/>
+                <w:sz w:val="16"/>
+              </w:rPr>
+              <w:t>Where to get it</w:t>
+            </w:r>
+          </w:p>
+        </w:tc>
+      </w:tr>
+      <w:tr>
+        <w:tc>
+          <w:tcPr>
+            <w:tcW w:type="dxa" w:w="1994"/>
+          </w:tcPr>
+          <w:p>
+            <w:r>
+              <w:rPr>
+                <w:b/>
+                <w:sz w:val="16"/>
+              </w:rPr>
+              <w:t>SF_TOKEN_URL</w:t>
+            </w:r>
+          </w:p>
+        </w:tc>
+        <w:tc>
+          <w:tcPr>
+            <w:tcW w:type="dxa" w:w="1994"/>
+          </w:tcPr>
+          <w:p>
+            <w:r>
+              <w:rPr>
+                <w:b/>
+                <w:color w:val="CC0000"/>
+                <w:sz w:val="16"/>
+              </w:rPr>
+              <w:t>YES</w:t>
+            </w:r>
+          </w:p>
+        </w:tc>
+        <w:tc>
+          <w:tcPr>
+            <w:tcW w:type="dxa" w:w="1994"/>
+          </w:tcPr>
+          <w:p>
+            <w:r>
+              <w:rPr>
+                <w:sz w:val="16"/>
+              </w:rPr>
+              <w:t>Salesforce OAuth 2.0 token endpoint for getting API access tokens.</w:t>
+            </w:r>
+          </w:p>
+        </w:tc>
+        <w:tc>
+          <w:tcPr>
+            <w:tcW w:type="dxa" w:w="1994"/>
+          </w:tcPr>
+          <w:p>
+            <w:r>
+              <w:rPr>
+                <w:sz w:val="16"/>
+              </w:rPr>
+              <w:t>https://login.salesforce.com/services/oauth2/token</w:t>
+            </w:r>
+          </w:p>
+        </w:tc>
+        <w:tc>
+          <w:tcPr>
+            <w:tcW w:type="dxa" w:w="1994"/>
+          </w:tcPr>
+          <w:p>
+            <w:r>
+              <w:rPr>
+                <w:sz w:val="16"/>
+              </w:rPr>
+              <w:t>Fixed for production. Same value as FSLAPP.</w:t>
+            </w:r>
+          </w:p>
+        </w:tc>
+      </w:tr>
+      <w:tr>
+        <w:tc>
+          <w:tcPr>
+            <w:tcW w:type="dxa" w:w="1994"/>
+          </w:tcPr>
+          <w:p>
+            <w:r>
+              <w:rPr>
+                <w:b/>
+                <w:sz w:val="16"/>
+              </w:rPr>
+              <w:t>SF_CONSUMER_KEY</w:t>
+            </w:r>
+          </w:p>
+        </w:tc>
+        <w:tc>
+          <w:tcPr>
+            <w:tcW w:type="dxa" w:w="1994"/>
+          </w:tcPr>
+          <w:p>
+            <w:r>
+              <w:rPr>
+                <w:b/>
+                <w:color w:val="CC0000"/>
+                <w:sz w:val="16"/>
+              </w:rPr>
+              <w:t>YES</w:t>
+            </w:r>
+          </w:p>
+        </w:tc>
+        <w:tc>
+          <w:tcPr>
+            <w:tcW w:type="dxa" w:w="1994"/>
+          </w:tcPr>
+          <w:p>
+            <w:r>
+              <w:rPr>
+                <w:sz w:val="16"/>
+              </w:rPr>
+              <w:t>Connected App Consumer Key. Same shared Connected App as FSLAPP.</w:t>
+            </w:r>
+          </w:p>
+        </w:tc>
+        <w:tc>
+          <w:tcPr>
+            <w:tcW w:type="dxa" w:w="1994"/>
+          </w:tcPr>
+          <w:p>
+            <w:r>
+              <w:rPr>
+                <w:sz w:val="16"/>
+              </w:rPr>
+              <w:t>Long alphanumeric string (50+ chars)</w:t>
+            </w:r>
+          </w:p>
+        </w:tc>
+        <w:tc>
+          <w:tcPr>
+            <w:tcW w:type="dxa" w:w="1994"/>
+          </w:tcPr>
+          <w:p>
+            <w:r>
+              <w:rPr>
+                <w:sz w:val="16"/>
+              </w:rPr>
+              <w:t>https://aaawcny.lightning.force.com/lightning/setup/ConnectedApplication/home → 'FSLAPP API' → View → Manage Consumer Details → Consumer Key</w:t>
+            </w:r>
+          </w:p>
+        </w:tc>
+      </w:tr>
+      <w:tr>
+        <w:tc>
+          <w:tcPr>
+            <w:tcW w:type="dxa" w:w="1994"/>
+          </w:tcPr>
+          <w:p>
+            <w:r>
+              <w:rPr>
+                <w:b/>
+                <w:sz w:val="16"/>
+              </w:rPr>
+              <w:t>SF_CONSUMER_SECRET</w:t>
+            </w:r>
+          </w:p>
+        </w:tc>
+        <w:tc>
+          <w:tcPr>
+            <w:tcW w:type="dxa" w:w="1994"/>
+          </w:tcPr>
+          <w:p>
+            <w:r>
+              <w:rPr>
+                <w:b/>
+                <w:color w:val="CC0000"/>
+                <w:sz w:val="16"/>
+              </w:rPr>
+              <w:t>YES</w:t>
+            </w:r>
+          </w:p>
+        </w:tc>
+        <w:tc>
+          <w:tcPr>
+            <w:tcW w:type="dxa" w:w="1994"/>
+          </w:tcPr>
+          <w:p>
+            <w:r>
+              <w:rPr>
+                <w:sz w:val="16"/>
+              </w:rPr>
+              <w:t>Connected App Consumer Secret. Keep confidential.</w:t>
+            </w:r>
+          </w:p>
+        </w:tc>
+        <w:tc>
+          <w:tcPr>
+            <w:tcW w:type="dxa" w:w="1994"/>
+          </w:tcPr>
+          <w:p>
+            <w:r>
+              <w:rPr>
+                <w:sz w:val="16"/>
+              </w:rPr>
+              <w:t>Alphanumeric string</w:t>
+            </w:r>
+          </w:p>
+        </w:tc>
+        <w:tc>
+          <w:tcPr>
+            <w:tcW w:type="dxa" w:w="1994"/>
+          </w:tcPr>
+          <w:p>
+            <w:r>
+              <w:rPr>
+                <w:sz w:val="16"/>
+              </w:rPr>
+              <w:t>https://aaawcny.lightning.force.com/lightning/setup/ConnectedApplication/home → Consumer Secret → click to reveal</w:t>
+            </w:r>
+          </w:p>
+        </w:tc>
+      </w:tr>
+      <w:tr>
+        <w:tc>
+          <w:tcPr>
+            <w:tcW w:type="dxa" w:w="1994"/>
+          </w:tcPr>
+          <w:p>
+            <w:r>
+              <w:rPr>
+                <w:b/>
+                <w:sz w:val="16"/>
+              </w:rPr>
+              <w:t>SF_USERNAME</w:t>
+            </w:r>
+          </w:p>
+        </w:tc>
+        <w:tc>
+          <w:tcPr>
+            <w:tcW w:type="dxa" w:w="1994"/>
+          </w:tcPr>
+          <w:p>
+            <w:r>
+              <w:rPr>
+                <w:b/>
+                <w:color w:val="CC0000"/>
+                <w:sz w:val="16"/>
+              </w:rPr>
+              <w:t>YES</w:t>
+            </w:r>
+          </w:p>
+        </w:tc>
+        <w:tc>
+          <w:tcPr>
+            <w:tcW w:type="dxa" w:w="1994"/>
+          </w:tcPr>
+          <w:p>
+            <w:r>
+              <w:rPr>
+                <w:sz w:val="16"/>
+              </w:rPr>
+              <w:t>Salesforce API integration user's username.</w:t>
+            </w:r>
+          </w:p>
+        </w:tc>
+        <w:tc>
+          <w:tcPr>
+            <w:tcW w:type="dxa" w:w="1994"/>
+          </w:tcPr>
+          <w:p>
+            <w:r>
+              <w:rPr>
+                <w:sz w:val="16"/>
+              </w:rPr>
+              <w:t>Email format. Example: api_user@aaawcny.com.fslapp</w:t>
+            </w:r>
+          </w:p>
+        </w:tc>
+        <w:tc>
+          <w:tcPr>
+            <w:tcW w:type="dxa" w:w="1994"/>
+          </w:tcPr>
+          <w:p>
+            <w:r>
+              <w:rPr>
+                <w:sz w:val="16"/>
+              </w:rPr>
+              <w:t>https://aaawcny.lightning.force.com/lightning/setup/ManageUsers/home → find 'FSLAPP API' integration user → copy Username</w:t>
+            </w:r>
+          </w:p>
+        </w:tc>
+      </w:tr>
+      <w:tr>
+        <w:tc>
+          <w:tcPr>
+            <w:tcW w:type="dxa" w:w="1994"/>
+          </w:tcPr>
+          <w:p>
+            <w:r>
+              <w:rPr>
+                <w:b/>
+                <w:sz w:val="16"/>
+              </w:rPr>
+              <w:t>SF_PASSWORD</w:t>
+            </w:r>
+          </w:p>
+        </w:tc>
+        <w:tc>
+          <w:tcPr>
+            <w:tcW w:type="dxa" w:w="1994"/>
+          </w:tcPr>
+          <w:p>
+            <w:r>
+              <w:rPr>
+                <w:b/>
+                <w:color w:val="CC0000"/>
+                <w:sz w:val="16"/>
+              </w:rPr>
+              <w:t>YES</w:t>
+            </w:r>
+          </w:p>
+        </w:tc>
+        <w:tc>
+          <w:tcPr>
+            <w:tcW w:type="dxa" w:w="1994"/>
+          </w:tcPr>
+          <w:p>
+            <w:r>
+              <w:rPr>
+                <w:sz w:val="16"/>
+              </w:rPr>
+              <w:t>Salesforce API user's password (without security token).</w:t>
+            </w:r>
+          </w:p>
+        </w:tc>
+        <w:tc>
+          <w:tcPr>
+            <w:tcW w:type="dxa" w:w="1994"/>
+          </w:tcPr>
+          <w:p>
+            <w:r>
+              <w:rPr>
+                <w:sz w:val="16"/>
+              </w:rPr>
+              <w:t>Password string</w:t>
+            </w:r>
+          </w:p>
+        </w:tc>
+        <w:tc>
+          <w:tcPr>
+            <w:tcW w:type="dxa" w:w="1994"/>
+          </w:tcPr>
+          <w:p>
+            <w:r>
+              <w:rPr>
+                <w:sz w:val="16"/>
+              </w:rPr>
+              <w:t>https://aaawcny.lightning.force.com/lightning/setup/ManageUsers/home → user → Reset Password if forgotten</w:t>
+            </w:r>
+          </w:p>
+        </w:tc>
+      </w:tr>
+      <w:tr>
+        <w:tc>
+          <w:tcPr>
+            <w:tcW w:type="dxa" w:w="1994"/>
+          </w:tcPr>
+          <w:p>
+            <w:r>
+              <w:rPr>
+                <w:b/>
+                <w:sz w:val="16"/>
+              </w:rPr>
+              <w:t>SF_SECURITY_TOKEN</w:t>
+            </w:r>
+          </w:p>
+        </w:tc>
+        <w:tc>
+          <w:tcPr>
+            <w:tcW w:type="dxa" w:w="1994"/>
+          </w:tcPr>
+          <w:p>
+            <w:r>
+              <w:rPr>
+                <w:b/>
+                <w:color w:val="CC0000"/>
+                <w:sz w:val="16"/>
+              </w:rPr>
+              <w:t>YES</w:t>
+            </w:r>
+          </w:p>
+        </w:tc>
+        <w:tc>
+          <w:tcPr>
+            <w:tcW w:type="dxa" w:w="1994"/>
+          </w:tcPr>
+          <w:p>
+            <w:r>
+              <w:rPr>
+                <w:sz w:val="16"/>
+              </w:rPr>
+              <w:t>Salesforce security token appended to the password for API login. App sends: SF_PASSWORD + SF_SECURITY_TOKEN as the combined password.</w:t>
+            </w:r>
+          </w:p>
+        </w:tc>
+        <w:tc>
+          <w:tcPr>
+            <w:tcW w:type="dxa" w:w="1994"/>
+          </w:tcPr>
+          <w:p>
+            <w:r>
+              <w:rPr>
+                <w:sz w:val="16"/>
+              </w:rPr>
+              <w:t>Alphanumeric (24 chars). Example: aBcDeFgH1234</w:t>
+            </w:r>
+          </w:p>
+        </w:tc>
+        <w:tc>
+          <w:tcPr>
+            <w:tcW w:type="dxa" w:w="1994"/>
+          </w:tcPr>
+          <w:p>
+            <w:r>
+              <w:rPr>
+                <w:sz w:val="16"/>
+              </w:rPr>
+              <w:t>Log in as the API user → My Settings → Reset My Security Token → token emailed. Link: https://aaawcny.lightning.force.com/lightning/settings/personal/PersonalInformation/home</w:t>
+            </w:r>
+          </w:p>
+        </w:tc>
+      </w:tr>
+    </w:tbl>
+    <w:p/>
+    <w:p>
+      <w:pPr>
+        <w:pStyle w:val="Heading2"/>
+        <w:jc w:val="left"/>
+      </w:pPr>
+      <w:r>
+        <w:t>4.4  AI / LLM API Keys</w:t>
+      </w:r>
+    </w:p>
+    <w:tbl>
+      <w:tblPr>
+        <w:tblStyle w:val="LightShading-Accent1"/>
+        <w:tblW w:type="auto" w:w="0"/>
+        <w:tblLook w:firstColumn="1" w:firstRow="1" w:lastColumn="0" w:lastRow="0" w:noHBand="0" w:noVBand="1" w:val="04A0"/>
+      </w:tblPr>
+      <w:tblGrid>
+        <w:gridCol w:w="1994"/>
+        <w:gridCol w:w="1994"/>
+        <w:gridCol w:w="1994"/>
+        <w:gridCol w:w="1994"/>
+        <w:gridCol w:w="1994"/>
+      </w:tblGrid>
+      <w:tr>
+        <w:tc>
+          <w:tcPr>
+            <w:tcW w:type="dxa" w:w="1994"/>
+          </w:tcPr>
+          <w:p>
+            <w:r>
+              <w:rPr>
+                <w:b/>
+                <w:sz w:val="16"/>
+              </w:rPr>
+              <w:t>Variable</w:t>
+            </w:r>
+          </w:p>
+        </w:tc>
+        <w:tc>
+          <w:tcPr>
+            <w:tcW w:type="dxa" w:w="1994"/>
+          </w:tcPr>
+          <w:p>
+            <w:r>
+              <w:rPr>
+                <w:b/>
+                <w:sz w:val="16"/>
+              </w:rPr>
+              <w:t>Required</w:t>
+            </w:r>
+          </w:p>
+        </w:tc>
+        <w:tc>
+          <w:tcPr>
+            <w:tcW w:type="dxa" w:w="1994"/>
+          </w:tcPr>
+          <w:p>
+            <w:r>
+              <w:rPr>
+                <w:b/>
+                <w:sz w:val="16"/>
+              </w:rPr>
+              <w:t>Purpose — What the app uses it for</w:t>
+            </w:r>
+          </w:p>
+        </w:tc>
+        <w:tc>
+          <w:tcPr>
+            <w:tcW w:type="dxa" w:w="1994"/>
+          </w:tcPr>
+          <w:p>
+            <w:r>
+              <w:rPr>
+                <w:b/>
+                <w:sz w:val="16"/>
+              </w:rPr>
+              <w:t>Format / Example Value</w:t>
+            </w:r>
+          </w:p>
+        </w:tc>
+        <w:tc>
+          <w:tcPr>
+            <w:tcW w:type="dxa" w:w="1994"/>
+          </w:tcPr>
+          <w:p>
+            <w:r>
+              <w:rPr>
+                <w:b/>
+                <w:sz w:val="16"/>
+              </w:rPr>
+              <w:t>Where to get it</w:t>
+            </w:r>
+          </w:p>
+        </w:tc>
+      </w:tr>
+      <w:tr>
+        <w:tc>
+          <w:tcPr>
+            <w:tcW w:type="dxa" w:w="1994"/>
+          </w:tcPr>
+          <w:p>
+            <w:r>
+              <w:rPr>
+                <w:b/>
+                <w:sz w:val="16"/>
+              </w:rPr>
+              <w:t>ANTHROPIC_API_KEY</w:t>
+            </w:r>
+          </w:p>
+        </w:tc>
+        <w:tc>
+          <w:tcPr>
+            <w:tcW w:type="dxa" w:w="1994"/>
+          </w:tcPr>
+          <w:p>
+            <w:r>
+              <w:rPr>
+                <w:b/>
+                <w:color w:val="CC0000"/>
+                <w:sz w:val="16"/>
+              </w:rPr>
+              <w:t>YES</w:t>
+            </w:r>
+          </w:p>
+        </w:tc>
+        <w:tc>
+          <w:tcPr>
+            <w:tcW w:type="dxa" w:w="1994"/>
+          </w:tcPr>
+          <w:p>
+            <w:r>
+              <w:rPr>
+                <w:sz w:val="16"/>
+              </w:rPr>
+              <w:t>API key for Claude Sonnet 4.6. Powers AI analysis features in SalesPulse.</w:t>
+            </w:r>
+          </w:p>
+        </w:tc>
+        <w:tc>
+          <w:tcPr>
+            <w:tcW w:type="dxa" w:w="1994"/>
+          </w:tcPr>
+          <w:p>
+            <w:r>
+              <w:rPr>
+                <w:sz w:val="16"/>
+              </w:rPr>
+              <w:t>Starts with 'sk-ant-'. Example: sk-ant-api03-XXXX... (108 chars)</w:t>
+            </w:r>
+          </w:p>
+        </w:tc>
+        <w:tc>
+          <w:tcPr>
+            <w:tcW w:type="dxa" w:w="1994"/>
+          </w:tcPr>
+          <w:p>
+            <w:r>
+              <w:rPr>
+                <w:sz w:val="16"/>
+              </w:rPr>
+              <w:t>https://console.anthropic.com/settings/keys → Create Key → copy immediately.</w:t>
+            </w:r>
+          </w:p>
+        </w:tc>
+      </w:tr>
+      <w:tr>
+        <w:tc>
+          <w:tcPr>
+            <w:tcW w:type="dxa" w:w="1994"/>
+          </w:tcPr>
+          <w:p>
+            <w:r>
+              <w:rPr>
+                <w:b/>
+                <w:sz w:val="16"/>
+              </w:rPr>
+              <w:t>OPENAI_API_KEY</w:t>
+            </w:r>
+          </w:p>
+        </w:tc>
+        <w:tc>
+          <w:tcPr>
+            <w:tcW w:type="dxa" w:w="1994"/>
+          </w:tcPr>
+          <w:p>
+            <w:r>
+              <w:rPr>
+                <w:b/>
+                <w:color w:val="CC0000"/>
+                <w:sz w:val="16"/>
+              </w:rPr>
+              <w:t>YES</w:t>
+            </w:r>
+          </w:p>
+        </w:tc>
+        <w:tc>
+          <w:tcPr>
+            <w:tcW w:type="dxa" w:w="1994"/>
+          </w:tcPr>
+          <w:p>
+            <w:r>
+              <w:rPr>
+                <w:sz w:val="16"/>
+              </w:rPr>
+              <w:t>API key for GPT-4o. Secondary AI provider.</w:t>
+            </w:r>
+          </w:p>
+        </w:tc>
+        <w:tc>
+          <w:tcPr>
+            <w:tcW w:type="dxa" w:w="1994"/>
+          </w:tcPr>
+          <w:p>
+            <w:r>
+              <w:rPr>
+                <w:sz w:val="16"/>
+              </w:rPr>
+              <w:t>Starts with 'sk-'. Example: sk-proj-XXXX...</w:t>
+            </w:r>
+          </w:p>
+        </w:tc>
+        <w:tc>
+          <w:tcPr>
+            <w:tcW w:type="dxa" w:w="1994"/>
+          </w:tcPr>
+          <w:p>
+            <w:r>
+              <w:rPr>
+                <w:sz w:val="16"/>
+              </w:rPr>
+              <w:t>https://platform.openai.com/api-keys → Create new secret key → copy immediately.</w:t>
+            </w:r>
+          </w:p>
+        </w:tc>
+      </w:tr>
+      <w:tr>
+        <w:tc>
+          <w:tcPr>
+            <w:tcW w:type="dxa" w:w="1994"/>
+          </w:tcPr>
+          <w:p>
+            <w:r>
+              <w:rPr>
+                <w:b/>
+                <w:sz w:val="16"/>
+              </w:rPr>
+              <w:t>GOOGLE_AI_API_KEY</w:t>
+            </w:r>
+          </w:p>
+        </w:tc>
+        <w:tc>
+          <w:tcPr>
+            <w:tcW w:type="dxa" w:w="1994"/>
+          </w:tcPr>
+          <w:p>
+            <w:r>
+              <w:rPr>
+                <w:b/>
+                <w:color w:val="CC0000"/>
+                <w:sz w:val="16"/>
+              </w:rPr>
+              <w:t>YES</w:t>
+            </w:r>
+          </w:p>
+        </w:tc>
+        <w:tc>
+          <w:tcPr>
+            <w:tcW w:type="dxa" w:w="1994"/>
+          </w:tcPr>
+          <w:p>
+            <w:r>
+              <w:rPr>
+                <w:sz w:val="16"/>
+              </w:rPr>
+              <w:t>API key for Google Gemini. Third AI option.</w:t>
+            </w:r>
+          </w:p>
+        </w:tc>
+        <w:tc>
+          <w:tcPr>
+            <w:tcW w:type="dxa" w:w="1994"/>
+          </w:tcPr>
+          <w:p>
+            <w:r>
+              <w:rPr>
+                <w:sz w:val="16"/>
+              </w:rPr>
+              <w:t>Starts with 'AIza'. Example: AIzaSyXXXX... (39 chars)</w:t>
+            </w:r>
+          </w:p>
+        </w:tc>
+        <w:tc>
+          <w:tcPr>
+            <w:tcW w:type="dxa" w:w="1994"/>
+          </w:tcPr>
+          <w:p>
+            <w:r>
+              <w:rPr>
+                <w:sz w:val="16"/>
+              </w:rPr>
+              <w:t>https://aistudio.google.com/app/apikey → Create API Key → copy.</w:t>
+            </w:r>
+          </w:p>
+        </w:tc>
+      </w:tr>
+      <w:tr>
+        <w:tc>
+          <w:tcPr>
+            <w:tcW w:type="dxa" w:w="1994"/>
+          </w:tcPr>
+          <w:p>
+            <w:r>
+              <w:rPr>
+                <w:b/>
+                <w:sz w:val="16"/>
+              </w:rPr>
+              <w:t>GOOGLE_MAPS_API_KEY</w:t>
+            </w:r>
+          </w:p>
+        </w:tc>
+        <w:tc>
+          <w:tcPr>
+            <w:tcW w:type="dxa" w:w="1994"/>
+          </w:tcPr>
+          <w:p>
+            <w:r>
+              <w:rPr>
+                <w:b/>
+                <w:color w:val="CC0000"/>
+                <w:sz w:val="16"/>
+              </w:rPr>
+              <w:t>YES</w:t>
+            </w:r>
+          </w:p>
+        </w:tc>
+        <w:tc>
+          <w:tcPr>
+            <w:tcW w:type="dxa" w:w="1994"/>
+          </w:tcPr>
+          <w:p>
+            <w:r>
+              <w:rPr>
+                <w:sz w:val="16"/>
+              </w:rPr>
+              <w:t>Google Maps Platform key for location features.</w:t>
+            </w:r>
+          </w:p>
+        </w:tc>
+        <w:tc>
+          <w:tcPr>
+            <w:tcW w:type="dxa" w:w="1994"/>
+          </w:tcPr>
+          <w:p>
+            <w:r>
+              <w:rPr>
+                <w:sz w:val="16"/>
+              </w:rPr>
+              <w:t>Starts with 'AIza'. Example: AIzaSyXXXX... (39 chars)</w:t>
+            </w:r>
+          </w:p>
+        </w:tc>
+        <w:tc>
+          <w:tcPr>
+            <w:tcW w:type="dxa" w:w="1994"/>
+          </w:tcPr>
+          <w:p>
+            <w:r>
+              <w:rPr>
+                <w:sz w:val="16"/>
+              </w:rPr>
+              <w:t>https://console.cloud.google.com/apis/credentials → Create credentials → API key → restrict to Maps + Geocoding APIs.</w:t>
+            </w:r>
+          </w:p>
+        </w:tc>
+      </w:tr>
+    </w:tbl>
+    <w:p/>
+    <w:p>
+      <w:pPr>
+        <w:pStyle w:val="Heading2"/>
+        <w:jc w:val="left"/>
+      </w:pPr>
+      <w:r>
+        <w:t>4.5  GitHub</w:t>
+      </w:r>
+    </w:p>
+    <w:tbl>
+      <w:tblPr>
+        <w:tblStyle w:val="LightShading-Accent1"/>
+        <w:tblW w:type="auto" w:w="0"/>
+        <w:tblLook w:firstColumn="1" w:firstRow="1" w:lastColumn="0" w:lastRow="0" w:noHBand="0" w:noVBand="1" w:val="04A0"/>
+      </w:tblPr>
+      <w:tblGrid>
+        <w:gridCol w:w="1994"/>
+        <w:gridCol w:w="1994"/>
+        <w:gridCol w:w="1994"/>
+        <w:gridCol w:w="1994"/>
+        <w:gridCol w:w="1994"/>
+      </w:tblGrid>
+      <w:tr>
+        <w:tc>
+          <w:tcPr>
+            <w:tcW w:type="dxa" w:w="1994"/>
+          </w:tcPr>
+          <w:p>
+            <w:r>
+              <w:rPr>
+                <w:b/>
+                <w:sz w:val="16"/>
+              </w:rPr>
+              <w:t>Variable</w:t>
+            </w:r>
+          </w:p>
+        </w:tc>
+        <w:tc>
+          <w:tcPr>
+            <w:tcW w:type="dxa" w:w="1994"/>
+          </w:tcPr>
+          <w:p>
+            <w:r>
+              <w:rPr>
+                <w:b/>
+                <w:sz w:val="16"/>
+              </w:rPr>
+              <w:t>Required</w:t>
+            </w:r>
+          </w:p>
+        </w:tc>
+        <w:tc>
+          <w:tcPr>
+            <w:tcW w:type="dxa" w:w="1994"/>
+          </w:tcPr>
+          <w:p>
+            <w:r>
+              <w:rPr>
+                <w:b/>
+                <w:sz w:val="16"/>
+              </w:rPr>
+              <w:t>Purpose — What the app uses it for</w:t>
+            </w:r>
+          </w:p>
+        </w:tc>
+        <w:tc>
+          <w:tcPr>
+            <w:tcW w:type="dxa" w:w="1994"/>
+          </w:tcPr>
+          <w:p>
+            <w:r>
+              <w:rPr>
+                <w:b/>
+                <w:sz w:val="16"/>
+              </w:rPr>
+              <w:t>Format / Example Value</w:t>
+            </w:r>
+          </w:p>
+        </w:tc>
+        <w:tc>
+          <w:tcPr>
+            <w:tcW w:type="dxa" w:w="1994"/>
+          </w:tcPr>
+          <w:p>
+            <w:r>
+              <w:rPr>
+                <w:b/>
+                <w:sz w:val="16"/>
+              </w:rPr>
+              <w:t>Where to get it</w:t>
+            </w:r>
+          </w:p>
+        </w:tc>
+      </w:tr>
+      <w:tr>
+        <w:tc>
+          <w:tcPr>
+            <w:tcW w:type="dxa" w:w="1994"/>
+          </w:tcPr>
+          <w:p>
+            <w:r>
+              <w:rPr>
+                <w:b/>
+                <w:sz w:val="16"/>
+              </w:rPr>
+              <w:t>GITHUB_TOKEN</w:t>
+            </w:r>
+          </w:p>
+        </w:tc>
+        <w:tc>
+          <w:tcPr>
+            <w:tcW w:type="dxa" w:w="1994"/>
+          </w:tcPr>
+          <w:p>
+            <w:r>
+              <w:rPr>
+                <w:b/>
+                <w:color w:val="CC0000"/>
+                <w:sz w:val="16"/>
+              </w:rPr>
+              <w:t>YES</w:t>
+            </w:r>
+          </w:p>
+        </w:tc>
+        <w:tc>
+          <w:tcPr>
+            <w:tcW w:type="dxa" w:w="1994"/>
+          </w:tcPr>
+          <w:p>
+            <w:r>
+              <w:rPr>
+                <w:sz w:val="16"/>
+              </w:rPr>
+              <w:t>GitHub Personal Access Token for reading repo data and code version display.</w:t>
+            </w:r>
+          </w:p>
+        </w:tc>
+        <w:tc>
+          <w:tcPr>
+            <w:tcW w:type="dxa" w:w="1994"/>
+          </w:tcPr>
+          <w:p>
+            <w:r>
+              <w:rPr>
+                <w:sz w:val="16"/>
+              </w:rPr>
+              <w:t>Starts with 'ghp_'. Example: ghp_XXXX... (40 chars)</w:t>
+            </w:r>
+          </w:p>
+        </w:tc>
+        <w:tc>
+          <w:tcPr>
+            <w:tcW w:type="dxa" w:w="1994"/>
+          </w:tcPr>
+          <w:p>
+            <w:r>
+              <w:rPr>
+                <w:sz w:val="16"/>
+              </w:rPr>
+              <w:t>https://github.com/settings/tokens → Generate new token → Scopes: repo (read-only) → copy immediately.</w:t>
+            </w:r>
+          </w:p>
+        </w:tc>
+      </w:tr>
+    </w:tbl>
+    <w:p/>
+    <w:p>
+      <w:pPr>
+        <w:pStyle w:val="Heading1"/>
+        <w:jc w:val="left"/>
+      </w:pPr>
+      <w:r>
+        <w:t>5. Managed Identity</w:t>
       </w:r>
     </w:p>
     <w:p>
@@ -2190,56 +3256,37 @@
         <w:rPr>
           <w:sz w:val="22"/>
         </w:rPr>
-        <w:t>Status = On. Object ID identifies this app in Entra — needed for DB grants.</w:t>
+        <w:t>System assigned: Status = On  (must stay On — if Off, all DB connections fail)</w:t>
+      </w:r>
+    </w:p>
+    <w:p>
+      <w:pPr>
+        <w:pStyle w:val="ListNumber"/>
+      </w:pPr>
+      <w:r>
+        <w:rPr>
+          <w:sz w:val="22"/>
+        </w:rPr>
+        <w:t>Object (principal) ID — note this for registering in PostgreSQL</w:t>
+      </w:r>
+    </w:p>
+    <w:p>
+      <w:pPr>
+        <w:pStyle w:val="Heading2"/>
+        <w:jc w:val="left"/>
+      </w:pPr>
+      <w:r>
+        <w:t>5.1  Register salespulse-nyaaa in PostgreSQL (one-time setup)</w:t>
       </w:r>
     </w:p>
     <w:p>
       <w:r>
-        <w:drawing>
-          <wp:inline xmlns:a="http://schemas.openxmlformats.org/drawingml/2006/main" xmlns:pic="http://schemas.openxmlformats.org/drawingml/2006/picture">
-            <wp:extent cx="5943600" cy="2848637"/>
-            <wp:docPr id="8" name="Picture 8"/>
-            <wp:cNvGraphicFramePr>
-              <a:graphicFrameLocks noChangeAspect="1"/>
-            </wp:cNvGraphicFramePr>
-            <a:graphic>
-              <a:graphicData uri="http://schemas.openxmlformats.org/drawingml/2006/picture">
-                <pic:pic>
-                  <pic:nvPicPr>
-                    <pic:cNvPr id="0" name="01_appservice_overview.png"/>
-                    <pic:cNvPicPr/>
-                  </pic:nvPicPr>
-                  <pic:blipFill>
-                    <a:blip r:embed="rId10"/>
-                    <a:stretch>
-                      <a:fillRect/>
-                    </a:stretch>
-                  </pic:blipFill>
-                  <pic:spPr>
-                    <a:xfrm>
-                      <a:off x="0" y="0"/>
-                      <a:ext cx="5943600" cy="2848637"/>
-                    </a:xfrm>
-                    <a:prstGeom prst="rect"/>
-                  </pic:spPr>
-                </pic:pic>
-              </a:graphicData>
-            </a:graphic>
-          </wp:inline>
-        </w:drawing>
-      </w:r>
-    </w:p>
-    <w:p>
-      <w:pPr>
-        <w:jc w:val="center"/>
-      </w:pPr>
-      <w:r>
         <w:rPr>
-          <w:i/>
-          <w:color w:val="555555"/>
-          <w:sz w:val="18"/>
+          <w:b/>
+          <w:color w:val="FF8C00"/>
+          <w:sz w:val="20"/>
         </w:rPr>
-        <w:t>Managed Identity — Status ON. If turned Off, all DB connections will fail immediately.</w:t>
+        <w:t>⚠  Already configured. Only run this if setting up a brand-new App Service instance.</w:t>
       </w:r>
     </w:p>
     <w:p>
@@ -2252,11 +3299,10 @@
           <w:color w:val="1A1A1A"/>
           <w:sz w:val="18"/>
         </w:rPr>
-        <w:t># Grant salespulse managed identity access to PostgreSQL (one-time setup):</w:t>
-        <w:br/>
         <w:t>export PGPASSWORD=$(az account get-access-token \</w:t>
         <w:br/>
         <w:t xml:space="preserve">  --resource-type oss-rdbms --query accessToken -o tsv)</w:t>
+        <w:br/>
         <w:br/>
         <w:t>PGSSLMODE=require psql \</w:t>
         <w:br/>
@@ -2265,7 +3311,7 @@
         <w:t xml:space="preserve">  -U nlaaroubi@nyaaa.com -d fslapp</w:t>
         <w:br/>
         <w:br/>
-        <w:t>-- In psql:</w:t>
+        <w:t>-- Register salespulse managed identity:</w:t>
         <w:br/>
         <w:t>SELECT * FROM pgaadauth_create_principal('salespulse-nyaaa', false, false);</w:t>
         <w:br/>
@@ -2279,22 +3325,12 @@
       </w:r>
     </w:p>
     <w:p>
-      <w:r>
-        <w:rPr>
-          <w:b/>
-          <w:color w:val="0078D4"/>
-          <w:sz w:val="20"/>
-        </w:rPr>
-        <w:t>ℹ  Repeat for fslapp-pg-dr (DR DB) using the same SQL — just change the hostname.</w:t>
-      </w:r>
-    </w:p>
-    <w:p>
       <w:pPr>
         <w:pStyle w:val="Heading1"/>
         <w:jc w:val="left"/>
       </w:pPr>
       <w:r>
-        <w:t>5. PostgreSQL Admin</w:t>
+        <w:t>6. Access Control — IAM</w:t>
       </w:r>
     </w:p>
     <w:p>
@@ -2305,7 +3341,7 @@
         <w:rPr>
           <w:sz w:val="22"/>
         </w:rPr>
-        <w:t xml:space="preserve">Primary DB: </w:t>
+        <w:t xml:space="preserve">Open: </w:t>
       </w:r>
       <w:r>
         <w:rPr>
@@ -2313,7 +3349,7 @@
           <w:color w:val="005ACC"/>
           <w:sz w:val="20"/>
         </w:rPr>
-        <w:t>https://portal.azure.com/#@nyaaa.com/resource/subscriptions/e287db16-b6ae-415e-bd52-41c8ec5a8f08/resourceGroups/rg-nlaaroubi-sbx-eus2-001/providers/Microsoft.DBforPostgreSQL/flexibleServers/fslapp-pg/overview</w:t>
+        <w:t>https://portal.azure.com/#@nyaaa.com/resource/subscriptions/e287db16-b6ae-415e-bd52-41c8ec5a8f08/resourceGroups/rg-nlaaroubi-sbx-eus2-001/providers/Microsoft.Web/sites/salespulse-nyaaa/users</w:t>
       </w:r>
     </w:p>
     <w:p>
@@ -2324,15 +3360,7 @@
         <w:rPr>
           <w:sz w:val="22"/>
         </w:rPr>
-        <w:t xml:space="preserve">DR DB: </w:t>
-      </w:r>
-      <w:r>
-        <w:rPr>
-          <w:b/>
-          <w:color w:val="005ACC"/>
-          <w:sz w:val="20"/>
-        </w:rPr>
-        <w:t>https://portal.azure.com/#@nyaaa.com/resource/subscriptions/e287db16-b6ae-415e-bd52-41c8ec5a8f08/resourceGroups/rg-nlaaroubi-sbx-eus2-001/providers/Microsoft.DBforPostgreSQL/flexibleServers/fslapp-pg-dr/overview</w:t>
+        <w:t>Role assignments tab → see users and roles.</w:t>
       </w:r>
     </w:p>
     <w:p>
@@ -2343,7 +3371,7 @@
         <w:rPr>
           <w:sz w:val="22"/>
         </w:rPr>
-        <w:t>Status = Ready. Endpoint = fslapp-pg.postgres.database.azure.com</w:t>
+        <w:t>Add: + Add → Add role assignment → choose role → choose user → Review + assign</w:t>
       </w:r>
     </w:p>
     <w:p>
@@ -2354,204 +3382,7 @@
         <w:rPr>
           <w:sz w:val="22"/>
         </w:rPr>
-        <w:t>SalesPulse uses schema: sales.  FSLAPP uses: core, optimizer.  All on the same server.</w:t>
-      </w:r>
-    </w:p>
-    <w:p>
-      <w:r>
-        <w:drawing>
-          <wp:inline xmlns:a="http://schemas.openxmlformats.org/drawingml/2006/main" xmlns:pic="http://schemas.openxmlformats.org/drawingml/2006/picture">
-            <wp:extent cx="5943600" cy="2848637"/>
-            <wp:docPr id="9" name="Picture 9"/>
-            <wp:cNvGraphicFramePr>
-              <a:graphicFrameLocks noChangeAspect="1"/>
-            </wp:cNvGraphicFramePr>
-            <a:graphic>
-              <a:graphicData uri="http://schemas.openxmlformats.org/drawingml/2006/picture">
-                <pic:pic>
-                  <pic:nvPicPr>
-                    <pic:cNvPr id="0" name="01_appservice_overview.png"/>
-                    <pic:cNvPicPr/>
-                  </pic:nvPicPr>
-                  <pic:blipFill>
-                    <a:blip r:embed="rId10"/>
-                    <a:stretch>
-                      <a:fillRect/>
-                    </a:stretch>
-                  </pic:blipFill>
-                  <pic:spPr>
-                    <a:xfrm>
-                      <a:off x="0" y="0"/>
-                      <a:ext cx="5943600" cy="2848637"/>
-                    </a:xfrm>
-                    <a:prstGeom prst="rect"/>
-                  </pic:spPr>
-                </pic:pic>
-              </a:graphicData>
-            </a:graphic>
-          </wp:inline>
-        </w:drawing>
-      </w:r>
-    </w:p>
-    <w:p>
-      <w:pPr>
-        <w:jc w:val="center"/>
-      </w:pPr>
-      <w:r>
-        <w:rPr>
-          <w:i/>
-          <w:color w:val="555555"/>
-          <w:sz w:val="18"/>
-        </w:rPr>
-        <w:t>PostgreSQL fslapp-pg — shared by SalesPulse (sales schema) and FSLAPP (core/optimizer)</w:t>
-      </w:r>
-    </w:p>
-    <w:p>
-      <w:pPr>
-        <w:pStyle w:val="Heading2"/>
-        <w:jc w:val="left"/>
-      </w:pPr>
-      <w:r>
-        <w:t>Firewall — Add Your IP for Admin</w:t>
-      </w:r>
-    </w:p>
-    <w:p>
-      <w:r>
-        <w:rPr>
-          <w:b/>
-          <w:color w:val="FF8C00"/>
-          <w:sz w:val="20"/>
-        </w:rPr>
-        <w:t>⚠  Remove your IP from the firewall when finished. Never leave personal IPs permanently.</w:t>
-      </w:r>
-    </w:p>
-    <w:p>
-      <w:pPr>
-        <w:pStyle w:val="ListNumber"/>
-      </w:pPr>
-      <w:r>
-        <w:rPr>
-          <w:sz w:val="22"/>
-        </w:rPr>
-        <w:t xml:space="preserve">Primary firewall: </w:t>
-      </w:r>
-      <w:r>
-        <w:rPr>
-          <w:b/>
-          <w:color w:val="005ACC"/>
-          <w:sz w:val="20"/>
-        </w:rPr>
-        <w:t>https://portal.azure.com/#@nyaaa.com/resource/subscriptions/e287db16-b6ae-415e-bd52-41c8ec5a8f08/resourceGroups/rg-nlaaroubi-sbx-eus2-001/providers/Microsoft.DBforPostgreSQL/flexibleServers/fslapp-pg/networking</w:t>
-      </w:r>
-      <w:r>
-        <w:rPr>
-          <w:sz w:val="22"/>
-        </w:rPr>
-        <w:t xml:space="preserve">  →  → Add current client IP → Save</w:t>
-      </w:r>
-    </w:p>
-    <w:p>
-      <w:pPr>
-        <w:pStyle w:val="ListNumber"/>
-      </w:pPr>
-      <w:r>
-        <w:rPr>
-          <w:sz w:val="22"/>
-        </w:rPr>
-        <w:t xml:space="preserve">DR firewall: </w:t>
-      </w:r>
-      <w:r>
-        <w:rPr>
-          <w:b/>
-          <w:color w:val="005ACC"/>
-          <w:sz w:val="20"/>
-        </w:rPr>
-        <w:t>https://portal.azure.com/#@nyaaa.com/resource/subscriptions/e287db16-b6ae-415e-bd52-41c8ec5a8f08/resourceGroups/rg-nlaaroubi-sbx-eus2-001/providers/Microsoft.DBforPostgreSQL/flexibleServers/fslapp-pg-dr/networking</w:t>
-      </w:r>
-      <w:r>
-        <w:rPr>
-          <w:sz w:val="22"/>
-        </w:rPr>
-        <w:t xml:space="preserve">  →  → same steps</w:t>
-      </w:r>
-    </w:p>
-    <w:p>
-      <w:r>
-        <w:drawing>
-          <wp:inline xmlns:a="http://schemas.openxmlformats.org/drawingml/2006/main" xmlns:pic="http://schemas.openxmlformats.org/drawingml/2006/picture">
-            <wp:extent cx="5943600" cy="2848637"/>
-            <wp:docPr id="10" name="Picture 10"/>
-            <wp:cNvGraphicFramePr>
-              <a:graphicFrameLocks noChangeAspect="1"/>
-            </wp:cNvGraphicFramePr>
-            <a:graphic>
-              <a:graphicData uri="http://schemas.openxmlformats.org/drawingml/2006/picture">
-                <pic:pic>
-                  <pic:nvPicPr>
-                    <pic:cNvPr id="0" name="01_appservice_overview.png"/>
-                    <pic:cNvPicPr/>
-                  </pic:nvPicPr>
-                  <pic:blipFill>
-                    <a:blip r:embed="rId10"/>
-                    <a:stretch>
-                      <a:fillRect/>
-                    </a:stretch>
-                  </pic:blipFill>
-                  <pic:spPr>
-                    <a:xfrm>
-                      <a:off x="0" y="0"/>
-                      <a:ext cx="5943600" cy="2848637"/>
-                    </a:xfrm>
-                    <a:prstGeom prst="rect"/>
-                  </pic:spPr>
-                </pic:pic>
-              </a:graphicData>
-            </a:graphic>
-          </wp:inline>
-        </w:drawing>
-      </w:r>
-    </w:p>
-    <w:p>
-      <w:pPr>
-        <w:jc w:val="center"/>
-      </w:pPr>
-      <w:r>
-        <w:rPr>
-          <w:i/>
-          <w:color w:val="555555"/>
-          <w:sz w:val="18"/>
-        </w:rPr>
-        <w:t>Firewall rules — add your IP to connect from laptop. Remove when done.</w:t>
-      </w:r>
-    </w:p>
-    <w:p>
-      <w:pPr>
-        <w:ind w:left="432"/>
-      </w:pPr>
-      <w:r>
-        <w:rPr>
-          <w:rFonts w:ascii="Courier New" w:hAnsi="Courier New"/>
-          <w:color w:val="1A1A1A"/>
-          <w:sz w:val="18"/>
-        </w:rPr>
-        <w:t># Connect to PostgreSQL (SalesPulse schema)</w:t>
-        <w:br/>
-        <w:t>export PGPASSWORD=$(az account get-access-token \</w:t>
-        <w:br/>
-        <w:t xml:space="preserve">  --resource-type oss-rdbms --query accessToken -o tsv)</w:t>
-        <w:br/>
-        <w:t>PGSSLMODE=require psql \</w:t>
-        <w:br/>
-        <w:t xml:space="preserve">  -h fslapp-pg.postgres.database.azure.com \</w:t>
-        <w:br/>
-        <w:t xml:space="preserve">  -U nlaaroubi@nyaaa.com -d fslapp</w:t>
-        <w:br/>
-        <w:br/>
-        <w:t>-- SalesPulse tables:</w:t>
-        <w:br/>
-        <w:t>\dt sales.*</w:t>
-        <w:br/>
-        <w:t>SELECT COUNT(*) FROM sales.user_sessions;</w:t>
+        <w:t>Remove: check row → Delete</w:t>
       </w:r>
     </w:p>
     <w:p>
@@ -2565,27 +3396,26 @@
         <w:jc w:val="left"/>
       </w:pPr>
       <w:r>
-        <w:t>6. DR Failover — Step-by-Step</w:t>
+        <w:t>7. DR Failover — Step-by-Step</w:t>
       </w:r>
     </w:p>
     <w:p>
       <w:r>
         <w:rPr>
           <w:b/>
-          <w:color w:val="FF8C00"/>
+          <w:color w:val="CC0000"/>
           <w:sz w:val="20"/>
         </w:rPr>
-        <w:t>⚠  DB failover MUST coordinate both SalesPulse AND FSLAPP — they share fslapp-pg!</w:t>
+        <w:t>🔴  SalesPulse and FSLAPP share fslapp-pg-dr. Failing over the DB affects BOTH apps. Coordinate with the FSLAPP team BEFORE starting a failover.</w:t>
       </w:r>
     </w:p>
     <w:p>
+      <w:pPr>
+        <w:pStyle w:val="Heading2"/>
+        <w:jc w:val="left"/>
+      </w:pPr>
       <w:r>
-        <w:rPr>
-          <w:b/>
-          <w:color w:val="FF8C00"/>
-          <w:sz w:val="20"/>
-        </w:rPr>
-        <w:t>⚠  Full procedure: docs/dr/DR_RUNBOOK.md and DR_RUNBOOK_SalesPulse.docx</w:t>
+        <w:t>7.1  Activate DR App</w:t>
       </w:r>
     </w:p>
     <w:p>
@@ -2606,12 +3436,6 @@
         </w:rPr>
         <w:t>https://salespulse-nyaaa.azurewebsites.net</w:t>
       </w:r>
-      <w:r>
-        <w:rPr>
-          <w:sz w:val="22"/>
-        </w:rPr>
-        <w:t xml:space="preserve">  →  — page unreachable</w:t>
-      </w:r>
     </w:p>
     <w:p>
       <w:pPr>
@@ -2621,7 +3445,7 @@
         <w:rPr>
           <w:sz w:val="22"/>
         </w:rPr>
-        <w:t xml:space="preserve">2. Start DR app: </w:t>
+        <w:t xml:space="preserve">2. Open DR App Service: </w:t>
       </w:r>
       <w:r>
         <w:rPr>
@@ -2635,7 +3459,7 @@
         <w:rPr>
           <w:sz w:val="22"/>
         </w:rPr>
-        <w:t xml:space="preserve">  →  → click Start if stopped</w:t>
+        <w:t xml:space="preserve">  →  → click Start if Stopped</w:t>
       </w:r>
     </w:p>
     <w:p>
@@ -2646,7 +3470,7 @@
         <w:rPr>
           <w:sz w:val="22"/>
         </w:rPr>
-        <w:t xml:space="preserve">3. Point DR to DR DB: </w:t>
+        <w:t xml:space="preserve">3. Change DR DB host: </w:t>
       </w:r>
       <w:r>
         <w:rPr>
@@ -2660,7 +3484,7 @@
         <w:rPr>
           <w:sz w:val="22"/>
         </w:rPr>
-        <w:t xml:space="preserve">  →  → PG_HOST = fslapp-pg-dr.postgres.database.azure.com → Apply</w:t>
+        <w:t xml:space="preserve">  →  → FSLAPP_PG_HOST = fslapp-pg-dr.postgres.database.azure.com → Apply</w:t>
       </w:r>
     </w:p>
     <w:p>
@@ -2671,7 +3495,7 @@
         <w:rPr>
           <w:sz w:val="22"/>
         </w:rPr>
-        <w:t xml:space="preserve">4. Verify DR app: </w:t>
+        <w:t xml:space="preserve">4. Verify: </w:t>
       </w:r>
       <w:r>
         <w:rPr>
@@ -2690,7 +3514,16 @@
         <w:rPr>
           <w:sz w:val="22"/>
         </w:rPr>
-        <w:t>5. Update DNS CNAME to salespulse-nyaaa-dr.azurewebsites.net</w:t>
+        <w:t>5. Update DNS CNAME → salespulse-nyaaa-dr.azurewebsites.net</w:t>
+      </w:r>
+    </w:p>
+    <w:p>
+      <w:pPr>
+        <w:pStyle w:val="Heading2"/>
+        <w:jc w:val="left"/>
+      </w:pPr>
+      <w:r>
+        <w:t>7.2  Return to Primary</w:t>
       </w:r>
     </w:p>
     <w:p>
@@ -2701,7 +3534,76 @@
         <w:rPr>
           <w:sz w:val="22"/>
         </w:rPr>
-        <w:t>6. Also failover FSLAPP simultaneously — contact FSLAPP admin</w:t>
+        <w:t xml:space="preserve">1. Confirm primary DB ready: </w:t>
+      </w:r>
+      <w:r>
+        <w:rPr>
+          <w:b/>
+          <w:color w:val="005ACC"/>
+          <w:sz w:val="20"/>
+        </w:rPr>
+        <w:t>https://portal.azure.com/#@nyaaa.com/resource/subscriptions/e287db16-b6ae-415e-bd52-41c8ec5a8f08/resourceGroups/rg-nlaaroubi-sbx-eus2-001/providers/Microsoft.DBforPostgreSQL/flexibleServers/fslapp-pg/overview</w:t>
+      </w:r>
+      <w:r>
+        <w:rPr>
+          <w:sz w:val="22"/>
+        </w:rPr>
+        <w:t xml:space="preserve">  →  → Status = Ready</w:t>
+      </w:r>
+    </w:p>
+    <w:p>
+      <w:pPr>
+        <w:pStyle w:val="ListNumber"/>
+      </w:pPr>
+      <w:r>
+        <w:rPr>
+          <w:sz w:val="22"/>
+        </w:rPr>
+        <w:t xml:space="preserve">2. Reset env var: </w:t>
+      </w:r>
+      <w:r>
+        <w:rPr>
+          <w:b/>
+          <w:color w:val="005ACC"/>
+          <w:sz w:val="20"/>
+        </w:rPr>
+        <w:t>https://portal.azure.com/#@nyaaa.com/resource/subscriptions/e287db16-b6ae-415e-bd52-41c8ec5a8f08/resourceGroups/rg-nlaaroubi-sbx-eus2-001/providers/Microsoft.Web/sites/salespulse-nyaaa-dr/environmentVariablesAppSettings</w:t>
+      </w:r>
+      <w:r>
+        <w:rPr>
+          <w:sz w:val="22"/>
+        </w:rPr>
+        <w:t xml:space="preserve">  →  → FSLAPP_PG_HOST = fslapp-pg.postgres.database.azure.com → Apply</w:t>
+      </w:r>
+    </w:p>
+    <w:p>
+      <w:pPr>
+        <w:pStyle w:val="ListNumber"/>
+      </w:pPr>
+      <w:r>
+        <w:rPr>
+          <w:sz w:val="22"/>
+        </w:rPr>
+        <w:t>3. Revert DNS CNAME → salespulse-nyaaa.azurewebsites.net</w:t>
+      </w:r>
+    </w:p>
+    <w:p>
+      <w:pPr>
+        <w:pStyle w:val="ListNumber"/>
+      </w:pPr>
+      <w:r>
+        <w:rPr>
+          <w:sz w:val="22"/>
+        </w:rPr>
+        <w:t xml:space="preserve">4. Verify: </w:t>
+      </w:r>
+      <w:r>
+        <w:rPr>
+          <w:b/>
+          <w:color w:val="005ACC"/>
+          <w:sz w:val="20"/>
+        </w:rPr>
+        <w:t>https://salespulse-nyaaa.azurewebsites.net</w:t>
       </w:r>
     </w:p>
     <w:p>
@@ -2710,7 +3612,7 @@
         <w:jc w:val="left"/>
       </w:pPr>
       <w:r>
-        <w:t>7. External Service Admin Links</w:t>
+        <w:t>8. External Service Admin Links</w:t>
       </w:r>
     </w:p>
     <w:tbl>
@@ -2720,35 +3622,50 @@
         <w:tblLook w:firstColumn="1" w:firstRow="1" w:lastColumn="0" w:lastRow="0" w:noHBand="0" w:noVBand="1" w:val="04A0"/>
       </w:tblPr>
       <w:tblGrid>
-        <w:gridCol w:w="4703"/>
-        <w:gridCol w:w="4703"/>
+        <w:gridCol w:w="3324"/>
+        <w:gridCol w:w="3324"/>
+        <w:gridCol w:w="3324"/>
       </w:tblGrid>
       <w:tr>
         <w:tc>
           <w:tcPr>
-            <w:tcW w:type="dxa" w:w="4703"/>
+            <w:tcW w:type="dxa" w:w="3324"/>
           </w:tcPr>
           <w:p>
             <w:r>
               <w:rPr>
                 <w:b/>
-                <w:sz w:val="20"/>
+                <w:sz w:val="18"/>
               </w:rPr>
-              <w:t>Page</w:t>
+              <w:t>Service</w:t>
             </w:r>
           </w:p>
         </w:tc>
         <w:tc>
           <w:tcPr>
-            <w:tcW w:type="dxa" w:w="4703"/>
+            <w:tcW w:type="dxa" w:w="3324"/>
           </w:tcPr>
           <w:p>
             <w:r>
               <w:rPr>
                 <w:b/>
-                <w:sz w:val="20"/>
+                <w:sz w:val="18"/>
               </w:rPr>
-              <w:t>Exact Azure Portal URL</w:t>
+              <w:t>Purpose in SalesPulse</w:t>
+            </w:r>
+          </w:p>
+        </w:tc>
+        <w:tc>
+          <w:tcPr>
+            <w:tcW w:type="dxa" w:w="3324"/>
+          </w:tcPr>
+          <w:p>
+            <w:r>
+              <w:rPr>
+                <w:b/>
+                <w:sz w:val="18"/>
+              </w:rPr>
+              <w:t>Admin URL</w:t>
             </w:r>
           </w:p>
         </w:tc>
@@ -2756,48 +3673,33 @@
       <w:tr>
         <w:tc>
           <w:tcPr>
-            <w:tcW w:type="dxa" w:w="4703"/>
+            <w:tcW w:type="dxa" w:w="3324"/>
           </w:tcPr>
           <w:p>
             <w:r>
               <w:rPr>
                 <w:sz w:val="18"/>
               </w:rPr>
-              <w:t>Azure Portal</w:t>
+              <w:t>Salesforce</w:t>
             </w:r>
           </w:p>
         </w:tc>
         <w:tc>
           <w:tcPr>
-            <w:tcW w:type="dxa" w:w="4703"/>
+            <w:tcW w:type="dxa" w:w="3324"/>
           </w:tcPr>
           <w:p>
             <w:r>
               <w:rPr>
                 <w:sz w:val="18"/>
               </w:rPr>
-              <w:t>https://portal.azure.com</w:t>
-            </w:r>
-          </w:p>
-        </w:tc>
-      </w:tr>
-      <w:tr>
-        <w:tc>
-          <w:tcPr>
-            <w:tcW w:type="dxa" w:w="4703"/>
-          </w:tcPr>
-          <w:p>
-            <w:r>
-              <w:rPr>
-                <w:sz w:val="18"/>
-              </w:rPr>
-              <w:t>Salesforce org</w:t>
+              <w:t>Opportunity, account, membership data</w:t>
             </w:r>
           </w:p>
         </w:tc>
         <w:tc>
           <w:tcPr>
-            <w:tcW w:type="dxa" w:w="4703"/>
+            <w:tcW w:type="dxa" w:w="3324"/>
           </w:tcPr>
           <w:p>
             <w:r>
@@ -2812,20 +3714,33 @@
       <w:tr>
         <w:tc>
           <w:tcPr>
-            <w:tcW w:type="dxa" w:w="4703"/>
+            <w:tcW w:type="dxa" w:w="3324"/>
           </w:tcPr>
           <w:p>
             <w:r>
               <w:rPr>
                 <w:sz w:val="18"/>
               </w:rPr>
-              <w:t>Salesforce Setup — Connected Apps</w:t>
+              <w:t>SF Setup → Apps</w:t>
             </w:r>
           </w:p>
         </w:tc>
         <w:tc>
           <w:tcPr>
-            <w:tcW w:type="dxa" w:w="4703"/>
+            <w:tcW w:type="dxa" w:w="3324"/>
+          </w:tcPr>
+          <w:p>
+            <w:r>
+              <w:rPr>
+                <w:sz w:val="18"/>
+              </w:rPr>
+              <w:t>Manage Connected App</w:t>
+            </w:r>
+          </w:p>
+        </w:tc>
+        <w:tc>
+          <w:tcPr>
+            <w:tcW w:type="dxa" w:w="3324"/>
           </w:tcPr>
           <w:p>
             <w:r>
@@ -2840,20 +3755,74 @@
       <w:tr>
         <w:tc>
           <w:tcPr>
-            <w:tcW w:type="dxa" w:w="4703"/>
+            <w:tcW w:type="dxa" w:w="3324"/>
           </w:tcPr>
           <w:p>
             <w:r>
               <w:rPr>
                 <w:sz w:val="18"/>
               </w:rPr>
-              <w:t>OpenAI — API keys</w:t>
+              <w:t>Anthropic</w:t>
             </w:r>
           </w:p>
         </w:tc>
         <w:tc>
           <w:tcPr>
-            <w:tcW w:type="dxa" w:w="4703"/>
+            <w:tcW w:type="dxa" w:w="3324"/>
+          </w:tcPr>
+          <w:p>
+            <w:r>
+              <w:rPr>
+                <w:sz w:val="18"/>
+              </w:rPr>
+              <w:t>Claude Sonnet 4.6 (AI analysis)</w:t>
+            </w:r>
+          </w:p>
+        </w:tc>
+        <w:tc>
+          <w:tcPr>
+            <w:tcW w:type="dxa" w:w="3324"/>
+          </w:tcPr>
+          <w:p>
+            <w:r>
+              <w:rPr>
+                <w:sz w:val="18"/>
+              </w:rPr>
+              <w:t>https://console.anthropic.com/settings/keys</w:t>
+            </w:r>
+          </w:p>
+        </w:tc>
+      </w:tr>
+      <w:tr>
+        <w:tc>
+          <w:tcPr>
+            <w:tcW w:type="dxa" w:w="3324"/>
+          </w:tcPr>
+          <w:p>
+            <w:r>
+              <w:rPr>
+                <w:sz w:val="18"/>
+              </w:rPr>
+              <w:t>OpenAI</w:t>
+            </w:r>
+          </w:p>
+        </w:tc>
+        <w:tc>
+          <w:tcPr>
+            <w:tcW w:type="dxa" w:w="3324"/>
+          </w:tcPr>
+          <w:p>
+            <w:r>
+              <w:rPr>
+                <w:sz w:val="18"/>
+              </w:rPr>
+              <w:t>GPT-4o (secondary AI)</w:t>
+            </w:r>
+          </w:p>
+        </w:tc>
+        <w:tc>
+          <w:tcPr>
+            <w:tcW w:type="dxa" w:w="3324"/>
           </w:tcPr>
           <w:p>
             <w:r>
@@ -2868,27 +3837,40 @@
       <w:tr>
         <w:tc>
           <w:tcPr>
-            <w:tcW w:type="dxa" w:w="4703"/>
+            <w:tcW w:type="dxa" w:w="3324"/>
           </w:tcPr>
           <w:p>
             <w:r>
               <w:rPr>
                 <w:sz w:val="18"/>
               </w:rPr>
-              <w:t>Anthropic — Claude keys</w:t>
+              <w:t>Google AI</w:t>
             </w:r>
           </w:p>
         </w:tc>
         <w:tc>
           <w:tcPr>
-            <w:tcW w:type="dxa" w:w="4703"/>
+            <w:tcW w:type="dxa" w:w="3324"/>
           </w:tcPr>
           <w:p>
             <w:r>
               <w:rPr>
                 <w:sz w:val="18"/>
               </w:rPr>
-              <w:t>https://console.anthropic.com/account/keys</w:t>
+              <w:t>Gemini (third AI option)</w:t>
+            </w:r>
+          </w:p>
+        </w:tc>
+        <w:tc>
+          <w:tcPr>
+            <w:tcW w:type="dxa" w:w="3324"/>
+          </w:tcPr>
+          <w:p>
+            <w:r>
+              <w:rPr>
+                <w:sz w:val="18"/>
+              </w:rPr>
+              <w:t>https://aistudio.google.com/app/apikey</w:t>
             </w:r>
           </w:p>
         </w:tc>
@@ -2896,27 +3878,81 @@
       <w:tr>
         <w:tc>
           <w:tcPr>
-            <w:tcW w:type="dxa" w:w="4703"/>
+            <w:tcW w:type="dxa" w:w="3324"/>
           </w:tcPr>
           <w:p>
             <w:r>
               <w:rPr>
                 <w:sz w:val="18"/>
               </w:rPr>
-              <w:t>GitHub repo — SalesPulse</w:t>
+              <w:t>Google Maps</w:t>
             </w:r>
           </w:p>
         </w:tc>
         <w:tc>
           <w:tcPr>
-            <w:tcW w:type="dxa" w:w="4703"/>
+            <w:tcW w:type="dxa" w:w="3324"/>
           </w:tcPr>
           <w:p>
             <w:r>
               <w:rPr>
                 <w:sz w:val="18"/>
               </w:rPr>
-              <w:t>https://github.com/nlaarh</w:t>
+              <w:t>Location features</w:t>
+            </w:r>
+          </w:p>
+        </w:tc>
+        <w:tc>
+          <w:tcPr>
+            <w:tcW w:type="dxa" w:w="3324"/>
+          </w:tcPr>
+          <w:p>
+            <w:r>
+              <w:rPr>
+                <w:sz w:val="18"/>
+              </w:rPr>
+              <w:t>https://console.cloud.google.com/apis/credentials</w:t>
+            </w:r>
+          </w:p>
+        </w:tc>
+      </w:tr>
+      <w:tr>
+        <w:tc>
+          <w:tcPr>
+            <w:tcW w:type="dxa" w:w="3324"/>
+          </w:tcPr>
+          <w:p>
+            <w:r>
+              <w:rPr>
+                <w:sz w:val="18"/>
+              </w:rPr>
+              <w:t>GitHub</w:t>
+            </w:r>
+          </w:p>
+        </w:tc>
+        <w:tc>
+          <w:tcPr>
+            <w:tcW w:type="dxa" w:w="3324"/>
+          </w:tcPr>
+          <w:p>
+            <w:r>
+              <w:rPr>
+                <w:sz w:val="18"/>
+              </w:rPr>
+              <w:t>Code repo, deployment source</w:t>
+            </w:r>
+          </w:p>
+        </w:tc>
+        <w:tc>
+          <w:tcPr>
+            <w:tcW w:type="dxa" w:w="3324"/>
+          </w:tcPr>
+          <w:p>
+            <w:r>
+              <w:rPr>
+                <w:sz w:val="18"/>
+              </w:rPr>
+              <w:t>https://github.com/settings/tokens</w:t>
             </w:r>
           </w:p>
         </w:tc>
@@ -2924,7 +3960,7 @@
     </w:tbl>
     <w:sectPr>
       <w:pgSz w:w="12240" w:h="15840"/>
-      <w:pgMar w:top="1134" w:right="1417" w:bottom="1134" w:left="1417" w:header="720" w:footer="720" w:gutter="0"/>
+      <w:pgMar w:top="1134" w:right="1134" w:bottom="1134" w:left="1134" w:header="720" w:footer="720" w:gutter="0"/>
       <w:cols w:space="720"/>
       <w:docGrid w:linePitch="360"/>
     </w:sectPr>

</xml_diff>